<commit_message>
WebTech Ex-2: strip CSS, mirror the sample form's markup
Same scope rule as Ex1. The registration form now uses only what the
sample in materials/ and Ex1 between them cover: label + <br> + input +
<br><br>, a comment per input type, no fieldset/legend, no stylesheet.
Colors are inline style attributes carried over from Ex1.

Re-ran it in the browser and filled every control for real, so the two
output screenshots are the empty and the filled-in form. Description and
Procedure rewritten to match. Deployed copy pushed and verified 200.

Co-Authored-By: Claude Opus 5 <noreply@anthropic.com>
Claude-Session: https://claude.ai/code/session_01WBfZKfGfJMQzPcPf1Vo4VR
</commit_message>
<xml_diff>
--- a/Subjects/WebTech/output/Ex2/Ex2_URK24CS1021.docx
+++ b/Subjects/WebTech/output/Ex2/Ex2_URK24CS1021.docx
@@ -299,7 +299,7 @@
           <w:sz w:val="24"/>
           <w:szCs w:val="24"/>
         </w:rPr>
-        <w:t>HTML5 introduced several new &lt;input&gt; types beyond plain text, each giving the browser its own built-in validation/UI: email (checks for an @ address), password (masks input), number (spinner + min/max), date (a date picker), range (a slider between min/max), and color (a color picker). Radio buttons let the user pick exactly one option from a group sharing the same name; checkboxes allow multiple. A &lt;select&gt; gives a fixed dropdown of options, while a &lt;datalist&gt; attached to a text input via the list attribute gives suggestions the user can still type past. &lt;fieldset&gt; and &lt;legend&gt; group related inputs with a labelled border, and each &lt;label&gt;'s for attribute ties it to its input's id for accessibility.</w:t>
+        <w:t>HTML5 introduced several new &lt;input&gt; types beyond plain text, each giving the browser its own built-in validation/UI: email (checks for an @ address), password (masks input), number (spinner + min/max), date (a date picker), range (a slider between min/max), and color (a color picker). Radio buttons let the user pick exactly one option from a group sharing the same name; checkboxes allow multiple. A &lt;select&gt; gives a fixed dropdown of options, while a &lt;datalist&gt; attached to a text input via the list attribute gives suggestions the user can still type past. Each &lt;label&gt;'s for attribute ties it to its input's id, and the fields are separated with &lt;br&gt; tags, the same way as in the sample form. The background and text colors are set with inline CSS, carried over from the Ex1 page.</w:t>
       </w:r>
       <w:r>
         <w:rPr>
@@ -390,13 +390,13 @@
         <w:br/>
         <w:t>2. Reskinned every field to the Respawn Point gaming theme instead of the generic student-registration wording (Gamer Tag instead of Full Name, Main Platform instead of Gender, Games You're Into instead of Skills, and so on).</w:t>
         <w:br/>
-        <w:t>3. Grouped the fields into three &lt;fieldset&gt; blocks (Account Details, About You, Gaming Preferences) so the form doesn't read as one long wall of inputs.</w:t>
-        <w:br/>
-        <w:t>4. Reused the exact CSS color variables from the Ex1 homepage so this page looks like part of the same site, then added form-specific styles for inputs, radios/checkboxes and the submit button.</w:t>
-        <w:br/>
-        <w:t>5. Added a back-link to the Ex1 homepage in the header.</w:t>
-        <w:br/>
-        <w:t>6. Opened the page in the browser, tried every field (typed text, picked a date, dragged the range slider, opened the color picker) to confirm they all actually work, then took the output screenshots.</w:t>
+        <w:t>3. Laid the fields out the same way as the sample form: a &lt;label&gt; with a for attribute, a &lt;br&gt;, the input, then &lt;br&gt;&lt;br&gt; before the next field, with an HTML comment naming the input type above each one.</w:t>
+        <w:br/>
+        <w:t>4. Used the same background and text colors as the Ex1 page, applied with inline CSS on the &lt;body&gt; tag and on the labels, so this page looks like part of the same site.</w:t>
+        <w:br/>
+        <w:t>5. Added a link at the top back to the Ex1 homepage.</w:t>
+        <w:br/>
+        <w:t>6. Opened the page in the browser and filled in every field (typed the text fields, entered a date, picked a radio button and two checkboxes, chose a dropdown option, typed a datalist suggestion and moved the range slider) to confirm they all actually work, then took the output screenshots of the empty and the filled-in form.</w:t>
       </w:r>
       <w:r>
         <w:rPr>
@@ -517,15 +517,6 @@
           <w:color w:val="202020"/>
           <w:sz w:val="20"/>
         </w:rPr>
-        <w:t xml:space="preserve">  &lt;meta name="viewport" content="width=device-width, initial-scale=1.0"&gt;</w:t>
-        <w:br/>
-      </w:r>
-      <w:r>
-        <w:rPr>
-          <w:rFonts w:ascii="Consolas" w:hAnsi="Consolas" w:cs="Consolas"/>
-          <w:color w:val="202020"/>
-          <w:sz w:val="20"/>
-        </w:rPr>
         <w:t xml:space="preserve">  &lt;title&gt;Join Respawn Point - Registration&lt;/title&gt;</w:t>
         <w:br/>
       </w:r>
@@ -535,106 +526,7 @@
           <w:color w:val="202020"/>
           <w:sz w:val="20"/>
         </w:rPr>
-        <w:t xml:space="preserve">  &lt;style&gt;</w:t>
-        <w:br/>
-      </w:r>
-      <w:r>
-        <w:rPr>
-          <w:rFonts w:ascii="Consolas" w:hAnsi="Consolas" w:cs="Consolas"/>
-          <w:color w:val="202020"/>
-          <w:sz w:val="20"/>
-        </w:rPr>
-        <w:t xml:space="preserve">    /* same palette as the Ex1 homepage so this reads as one site, not a</w:t>
-        <w:br/>
-      </w:r>
-      <w:r>
-        <w:rPr>
-          <w:rFonts w:ascii="Consolas" w:hAnsi="Consolas" w:cs="Consolas"/>
-          <w:color w:val="202020"/>
-          <w:sz w:val="20"/>
-        </w:rPr>
-        <w:t xml:space="preserve">       random new page */</w:t>
-        <w:br/>
-      </w:r>
-      <w:r>
-        <w:rPr>
-          <w:rFonts w:ascii="Consolas" w:hAnsi="Consolas" w:cs="Consolas"/>
-          <w:color w:val="202020"/>
-          <w:sz w:val="20"/>
-        </w:rPr>
-        <w:t xml:space="preserve">    :root {</w:t>
-        <w:br/>
-      </w:r>
-      <w:r>
-        <w:rPr>
-          <w:rFonts w:ascii="Consolas" w:hAnsi="Consolas" w:cs="Consolas"/>
-          <w:color w:val="202020"/>
-          <w:sz w:val="20"/>
-        </w:rPr>
-        <w:t xml:space="preserve">      --bg: #1c1b18;</w:t>
-        <w:br/>
-      </w:r>
-      <w:r>
-        <w:rPr>
-          <w:rFonts w:ascii="Consolas" w:hAnsi="Consolas" w:cs="Consolas"/>
-          <w:color w:val="202020"/>
-          <w:sz w:val="20"/>
-        </w:rPr>
-        <w:t xml:space="preserve">      --panel: #242220;</w:t>
-        <w:br/>
-      </w:r>
-      <w:r>
-        <w:rPr>
-          <w:rFonts w:ascii="Consolas" w:hAnsi="Consolas" w:cs="Consolas"/>
-          <w:color w:val="202020"/>
-          <w:sz w:val="20"/>
-        </w:rPr>
-        <w:t xml:space="preserve">      --orange: #e8792c;</w:t>
-        <w:br/>
-      </w:r>
-      <w:r>
-        <w:rPr>
-          <w:rFonts w:ascii="Consolas" w:hAnsi="Consolas" w:cs="Consolas"/>
-          <w:color w:val="202020"/>
-          <w:sz w:val="20"/>
-        </w:rPr>
-        <w:t xml:space="preserve">      --orange-soft: #f3a15c;</w:t>
-        <w:br/>
-      </w:r>
-      <w:r>
-        <w:rPr>
-          <w:rFonts w:ascii="Consolas" w:hAnsi="Consolas" w:cs="Consolas"/>
-          <w:color w:val="202020"/>
-          <w:sz w:val="20"/>
-        </w:rPr>
-        <w:t xml:space="preserve">      --green: #7fae5a;</w:t>
-        <w:br/>
-      </w:r>
-      <w:r>
-        <w:rPr>
-          <w:rFonts w:ascii="Consolas" w:hAnsi="Consolas" w:cs="Consolas"/>
-          <w:color w:val="202020"/>
-          <w:sz w:val="20"/>
-        </w:rPr>
-        <w:t xml:space="preserve">      --text: #eae6df;</w:t>
-        <w:br/>
-      </w:r>
-      <w:r>
-        <w:rPr>
-          <w:rFonts w:ascii="Consolas" w:hAnsi="Consolas" w:cs="Consolas"/>
-          <w:color w:val="202020"/>
-          <w:sz w:val="20"/>
-        </w:rPr>
-        <w:t xml:space="preserve">      --text-dim: #b7b1a4;</w:t>
-        <w:br/>
-      </w:r>
-      <w:r>
-        <w:rPr>
-          <w:rFonts w:ascii="Consolas" w:hAnsi="Consolas" w:cs="Consolas"/>
-          <w:color w:val="202020"/>
-          <w:sz w:val="20"/>
-        </w:rPr>
-        <w:t xml:space="preserve">    }</w:t>
+        <w:t>&lt;/head&gt;</w:t>
         <w:br/>
       </w:r>
       <w:r>
@@ -652,7 +544,7 @@
           <w:color w:val="202020"/>
           <w:sz w:val="20"/>
         </w:rPr>
-        <w:t xml:space="preserve">    * { box-sizing: border-box; }</w:t>
+        <w:t>&lt;body style="background-color: #1c1b18; color: #eae6df"&gt;</w:t>
         <w:br/>
       </w:r>
       <w:r>
@@ -670,61 +562,34 @@
           <w:color w:val="202020"/>
           <w:sz w:val="20"/>
         </w:rPr>
-        <w:t xml:space="preserve">    body {</w:t>
-        <w:br/>
-      </w:r>
-      <w:r>
-        <w:rPr>
-          <w:rFonts w:ascii="Consolas" w:hAnsi="Consolas" w:cs="Consolas"/>
-          <w:color w:val="202020"/>
-          <w:sz w:val="20"/>
-        </w:rPr>
-        <w:t xml:space="preserve">      background-color: var(--bg);</w:t>
-        <w:br/>
-      </w:r>
-      <w:r>
-        <w:rPr>
-          <w:rFonts w:ascii="Consolas" w:hAnsi="Consolas" w:cs="Consolas"/>
-          <w:color w:val="202020"/>
-          <w:sz w:val="20"/>
-        </w:rPr>
-        <w:t xml:space="preserve">      color: var(--text);</w:t>
-        <w:br/>
-      </w:r>
-      <w:r>
-        <w:rPr>
-          <w:rFonts w:ascii="Consolas" w:hAnsi="Consolas" w:cs="Consolas"/>
-          <w:color w:val="202020"/>
-          <w:sz w:val="20"/>
-        </w:rPr>
-        <w:t xml:space="preserve">      font-family: 'Segoe UI', Verdana, sans-serif;</w:t>
-        <w:br/>
-      </w:r>
-      <w:r>
-        <w:rPr>
-          <w:rFonts w:ascii="Consolas" w:hAnsi="Consolas" w:cs="Consolas"/>
-          <w:color w:val="202020"/>
-          <w:sz w:val="20"/>
-        </w:rPr>
-        <w:t xml:space="preserve">      margin: 0;</w:t>
-        <w:br/>
-      </w:r>
-      <w:r>
-        <w:rPr>
-          <w:rFonts w:ascii="Consolas" w:hAnsi="Consolas" w:cs="Consolas"/>
-          <w:color w:val="202020"/>
-          <w:sz w:val="20"/>
-        </w:rPr>
-        <w:t xml:space="preserve">      line-height: 1.6;</w:t>
-        <w:br/>
-      </w:r>
-      <w:r>
-        <w:rPr>
-          <w:rFonts w:ascii="Consolas" w:hAnsi="Consolas" w:cs="Consolas"/>
-          <w:color w:val="202020"/>
-          <w:sz w:val="20"/>
-        </w:rPr>
-        <w:t xml:space="preserve">    }</w:t>
+        <w:t xml:space="preserve">  &lt;!-- link back to the Ex1 homepage so the two pages are one site --&gt;</w:t>
+        <w:br/>
+      </w:r>
+      <w:r>
+        <w:rPr>
+          <w:rFonts w:ascii="Consolas" w:hAnsi="Consolas" w:cs="Consolas"/>
+          <w:color w:val="202020"/>
+          <w:sz w:val="20"/>
+        </w:rPr>
+        <w:t xml:space="preserve">  &lt;div style="background-color: #242220"&gt;</w:t>
+        <w:br/>
+      </w:r>
+      <w:r>
+        <w:rPr>
+          <w:rFonts w:ascii="Consolas" w:hAnsi="Consolas" w:cs="Consolas"/>
+          <w:color w:val="202020"/>
+          <w:sz w:val="20"/>
+        </w:rPr>
+        <w:t xml:space="preserve">    &lt;p&gt;&lt;b&gt;&lt;a href="../Ex1/index.html" style="color: #e8792c"&gt;Back to Respawn Point&lt;/a&gt;&lt;/b&gt;&lt;/p&gt;</w:t>
+        <w:br/>
+      </w:r>
+      <w:r>
+        <w:rPr>
+          <w:rFonts w:ascii="Consolas" w:hAnsi="Consolas" w:cs="Consolas"/>
+          <w:color w:val="202020"/>
+          <w:sz w:val="20"/>
+        </w:rPr>
+        <w:t xml:space="preserve">  &lt;/div&gt;</w:t>
         <w:br/>
       </w:r>
       <w:r>
@@ -742,43 +607,7 @@
           <w:color w:val="202020"/>
           <w:sz w:val="20"/>
         </w:rPr>
-        <w:t xml:space="preserve">    header {</w:t>
-        <w:br/>
-      </w:r>
-      <w:r>
-        <w:rPr>
-          <w:rFonts w:ascii="Consolas" w:hAnsi="Consolas" w:cs="Consolas"/>
-          <w:color w:val="202020"/>
-          <w:sz w:val="20"/>
-        </w:rPr>
-        <w:t xml:space="preserve">      background-color: var(--panel);</w:t>
-        <w:br/>
-      </w:r>
-      <w:r>
-        <w:rPr>
-          <w:rFonts w:ascii="Consolas" w:hAnsi="Consolas" w:cs="Consolas"/>
-          <w:color w:val="202020"/>
-          <w:sz w:val="20"/>
-        </w:rPr>
-        <w:t xml:space="preserve">      border-bottom: 2px solid var(--orange);</w:t>
-        <w:br/>
-      </w:r>
-      <w:r>
-        <w:rPr>
-          <w:rFonts w:ascii="Consolas" w:hAnsi="Consolas" w:cs="Consolas"/>
-          <w:color w:val="202020"/>
-          <w:sz w:val="20"/>
-        </w:rPr>
-        <w:t xml:space="preserve">      padding: 14px 24px;</w:t>
-        <w:br/>
-      </w:r>
-      <w:r>
-        <w:rPr>
-          <w:rFonts w:ascii="Consolas" w:hAnsi="Consolas" w:cs="Consolas"/>
-          <w:color w:val="202020"/>
-          <w:sz w:val="20"/>
-        </w:rPr>
-        <w:t xml:space="preserve">    }</w:t>
+        <w:t xml:space="preserve">  &lt;hr style="color: #e8792c"&gt;</w:t>
         <w:br/>
       </w:r>
       <w:r>
@@ -796,43 +625,34 @@
           <w:color w:val="202020"/>
           <w:sz w:val="20"/>
         </w:rPr>
-        <w:t xml:space="preserve">    header a {</w:t>
-        <w:br/>
-      </w:r>
-      <w:r>
-        <w:rPr>
-          <w:rFonts w:ascii="Consolas" w:hAnsi="Consolas" w:cs="Consolas"/>
-          <w:color w:val="202020"/>
-          <w:sz w:val="20"/>
-        </w:rPr>
-        <w:t xml:space="preserve">      color: var(--text-dim);</w:t>
-        <w:br/>
-      </w:r>
-      <w:r>
-        <w:rPr>
-          <w:rFonts w:ascii="Consolas" w:hAnsi="Consolas" w:cs="Consolas"/>
-          <w:color w:val="202020"/>
-          <w:sz w:val="20"/>
-        </w:rPr>
-        <w:t xml:space="preserve">      text-decoration: none;</w:t>
-        <w:br/>
-      </w:r>
-      <w:r>
-        <w:rPr>
-          <w:rFonts w:ascii="Consolas" w:hAnsi="Consolas" w:cs="Consolas"/>
-          <w:color w:val="202020"/>
-          <w:sz w:val="20"/>
-        </w:rPr>
-        <w:t xml:space="preserve">      font-weight: 600;</w:t>
-        <w:br/>
-      </w:r>
-      <w:r>
-        <w:rPr>
-          <w:rFonts w:ascii="Consolas" w:hAnsi="Consolas" w:cs="Consolas"/>
-          <w:color w:val="202020"/>
-          <w:sz w:val="20"/>
-        </w:rPr>
-        <w:t xml:space="preserve">    }</w:t>
+        <w:t xml:space="preserve">  &lt;h1 style="color: #e8792c"&gt;Join the Squad&lt;/h1&gt;</w:t>
+        <w:br/>
+      </w:r>
+      <w:r>
+        <w:rPr>
+          <w:rFonts w:ascii="Consolas" w:hAnsi="Consolas" w:cs="Consolas"/>
+          <w:color w:val="202020"/>
+          <w:sz w:val="20"/>
+        </w:rPr>
+        <w:t xml:space="preserve">  &lt;p style="color: #b7b1a4"&gt;</w:t>
+        <w:br/>
+      </w:r>
+      <w:r>
+        <w:rPr>
+          <w:rFonts w:ascii="Consolas" w:hAnsi="Consolas" w:cs="Consolas"/>
+          <w:color w:val="202020"/>
+          <w:sz w:val="20"/>
+        </w:rPr>
+        <w:t xml:space="preserve">    &lt;i&gt;fill this in and you're one step closer to not solo queuing anymore&lt;/i&gt;</w:t>
+        <w:br/>
+      </w:r>
+      <w:r>
+        <w:rPr>
+          <w:rFonts w:ascii="Consolas" w:hAnsi="Consolas" w:cs="Consolas"/>
+          <w:color w:val="202020"/>
+          <w:sz w:val="20"/>
+        </w:rPr>
+        <w:t xml:space="preserve">  &lt;/p&gt;</w:t>
         <w:br/>
       </w:r>
       <w:r>
@@ -850,25 +670,7 @@
           <w:color w:val="202020"/>
           <w:sz w:val="20"/>
         </w:rPr>
-        <w:t xml:space="preserve">    header a:hover {</w:t>
-        <w:br/>
-      </w:r>
-      <w:r>
-        <w:rPr>
-          <w:rFonts w:ascii="Consolas" w:hAnsi="Consolas" w:cs="Consolas"/>
-          <w:color w:val="202020"/>
-          <w:sz w:val="20"/>
-        </w:rPr>
-        <w:t xml:space="preserve">      color: var(--orange-soft);</w:t>
-        <w:br/>
-      </w:r>
-      <w:r>
-        <w:rPr>
-          <w:rFonts w:ascii="Consolas" w:hAnsi="Consolas" w:cs="Consolas"/>
-          <w:color w:val="202020"/>
-          <w:sz w:val="20"/>
-        </w:rPr>
-        <w:t xml:space="preserve">    }</w:t>
+        <w:t xml:space="preserve">  &lt;form action="#" method="post"&gt;</w:t>
         <w:br/>
       </w:r>
       <w:r>
@@ -886,43 +688,25 @@
           <w:color w:val="202020"/>
           <w:sz w:val="20"/>
         </w:rPr>
-        <w:t xml:space="preserve">    .wrap {</w:t>
-        <w:br/>
-      </w:r>
-      <w:r>
-        <w:rPr>
-          <w:rFonts w:ascii="Consolas" w:hAnsi="Consolas" w:cs="Consolas"/>
-          <w:color w:val="202020"/>
-          <w:sz w:val="20"/>
-        </w:rPr>
-        <w:t xml:space="preserve">      max-width: 640px;</w:t>
-        <w:br/>
-      </w:r>
-      <w:r>
-        <w:rPr>
-          <w:rFonts w:ascii="Consolas" w:hAnsi="Consolas" w:cs="Consolas"/>
-          <w:color w:val="202020"/>
-          <w:sz w:val="20"/>
-        </w:rPr>
-        <w:t xml:space="preserve">      margin: 0 auto;</w:t>
-        <w:br/>
-      </w:r>
-      <w:r>
-        <w:rPr>
-          <w:rFonts w:ascii="Consolas" w:hAnsi="Consolas" w:cs="Consolas"/>
-          <w:color w:val="202020"/>
-          <w:sz w:val="20"/>
-        </w:rPr>
-        <w:t xml:space="preserve">      padding: 40px 8% 60px;</w:t>
-        <w:br/>
-      </w:r>
-      <w:r>
-        <w:rPr>
-          <w:rFonts w:ascii="Consolas" w:hAnsi="Consolas" w:cs="Consolas"/>
-          <w:color w:val="202020"/>
-          <w:sz w:val="20"/>
-        </w:rPr>
-        <w:t xml:space="preserve">    }</w:t>
+        <w:t xml:space="preserve">    &lt;!-- Text Input --&gt;</w:t>
+        <w:br/>
+      </w:r>
+      <w:r>
+        <w:rPr>
+          <w:rFonts w:ascii="Consolas" w:hAnsi="Consolas" w:cs="Consolas"/>
+          <w:color w:val="202020"/>
+          <w:sz w:val="20"/>
+        </w:rPr>
+        <w:t xml:space="preserve">    &lt;label for="gamertag" style="color: #7fae5a"&gt;Gamer Tag:&lt;/label&gt;&lt;br&gt;</w:t>
+        <w:br/>
+      </w:r>
+      <w:r>
+        <w:rPr>
+          <w:rFonts w:ascii="Consolas" w:hAnsi="Consolas" w:cs="Consolas"/>
+          <w:color w:val="202020"/>
+          <w:sz w:val="20"/>
+        </w:rPr>
+        <w:t xml:space="preserve">    &lt;input type="text" id="gamertag" name="gamertag" placeholder="how people will see you" required&gt;&lt;br&gt;&lt;br&gt;</w:t>
         <w:br/>
       </w:r>
       <w:r>
@@ -940,43 +724,25 @@
           <w:color w:val="202020"/>
           <w:sz w:val="20"/>
         </w:rPr>
-        <w:t xml:space="preserve">    h1 {</w:t>
-        <w:br/>
-      </w:r>
-      <w:r>
-        <w:rPr>
-          <w:rFonts w:ascii="Consolas" w:hAnsi="Consolas" w:cs="Consolas"/>
-          <w:color w:val="202020"/>
-          <w:sz w:val="20"/>
-        </w:rPr>
-        <w:t xml:space="preserve">      color: var(--orange);</w:t>
-        <w:br/>
-      </w:r>
-      <w:r>
-        <w:rPr>
-          <w:rFonts w:ascii="Consolas" w:hAnsi="Consolas" w:cs="Consolas"/>
-          <w:color w:val="202020"/>
-          <w:sz w:val="20"/>
-        </w:rPr>
-        <w:t xml:space="preserve">      text-align: center;</w:t>
-        <w:br/>
-      </w:r>
-      <w:r>
-        <w:rPr>
-          <w:rFonts w:ascii="Consolas" w:hAnsi="Consolas" w:cs="Consolas"/>
-          <w:color w:val="202020"/>
-          <w:sz w:val="20"/>
-        </w:rPr>
-        <w:t xml:space="preserve">      margin-bottom: 4px;</w:t>
-        <w:br/>
-      </w:r>
-      <w:r>
-        <w:rPr>
-          <w:rFonts w:ascii="Consolas" w:hAnsi="Consolas" w:cs="Consolas"/>
-          <w:color w:val="202020"/>
-          <w:sz w:val="20"/>
-        </w:rPr>
-        <w:t xml:space="preserve">    }</w:t>
+        <w:t xml:space="preserve">    &lt;!-- Email Input --&gt;</w:t>
+        <w:br/>
+      </w:r>
+      <w:r>
+        <w:rPr>
+          <w:rFonts w:ascii="Consolas" w:hAnsi="Consolas" w:cs="Consolas"/>
+          <w:color w:val="202020"/>
+          <w:sz w:val="20"/>
+        </w:rPr>
+        <w:t xml:space="preserve">    &lt;label for="email" style="color: #7fae5a"&gt;Email:&lt;/label&gt;&lt;br&gt;</w:t>
+        <w:br/>
+      </w:r>
+      <w:r>
+        <w:rPr>
+          <w:rFonts w:ascii="Consolas" w:hAnsi="Consolas" w:cs="Consolas"/>
+          <w:color w:val="202020"/>
+          <w:sz w:val="20"/>
+        </w:rPr>
+        <w:t xml:space="preserve">    &lt;input type="email" id="email" name="email" placeholder="you@example.com" required&gt;&lt;br&gt;&lt;br&gt;</w:t>
         <w:br/>
       </w:r>
       <w:r>
@@ -994,52 +760,25 @@
           <w:color w:val="202020"/>
           <w:sz w:val="20"/>
         </w:rPr>
-        <w:t xml:space="preserve">    .subtitle {</w:t>
-        <w:br/>
-      </w:r>
-      <w:r>
-        <w:rPr>
-          <w:rFonts w:ascii="Consolas" w:hAnsi="Consolas" w:cs="Consolas"/>
-          <w:color w:val="202020"/>
-          <w:sz w:val="20"/>
-        </w:rPr>
-        <w:t xml:space="preserve">      text-align: center;</w:t>
-        <w:br/>
-      </w:r>
-      <w:r>
-        <w:rPr>
-          <w:rFonts w:ascii="Consolas" w:hAnsi="Consolas" w:cs="Consolas"/>
-          <w:color w:val="202020"/>
-          <w:sz w:val="20"/>
-        </w:rPr>
-        <w:t xml:space="preserve">      color: var(--text-dim);</w:t>
-        <w:br/>
-      </w:r>
-      <w:r>
-        <w:rPr>
-          <w:rFonts w:ascii="Consolas" w:hAnsi="Consolas" w:cs="Consolas"/>
-          <w:color w:val="202020"/>
-          <w:sz w:val="20"/>
-        </w:rPr>
-        <w:t xml:space="preserve">      margin-top: 0;</w:t>
-        <w:br/>
-      </w:r>
-      <w:r>
-        <w:rPr>
-          <w:rFonts w:ascii="Consolas" w:hAnsi="Consolas" w:cs="Consolas"/>
-          <w:color w:val="202020"/>
-          <w:sz w:val="20"/>
-        </w:rPr>
-        <w:t xml:space="preserve">      margin-bottom: 34px;</w:t>
-        <w:br/>
-      </w:r>
-      <w:r>
-        <w:rPr>
-          <w:rFonts w:ascii="Consolas" w:hAnsi="Consolas" w:cs="Consolas"/>
-          <w:color w:val="202020"/>
-          <w:sz w:val="20"/>
-        </w:rPr>
-        <w:t xml:space="preserve">    }</w:t>
+        <w:t xml:space="preserve">    &lt;!-- Password --&gt;</w:t>
+        <w:br/>
+      </w:r>
+      <w:r>
+        <w:rPr>
+          <w:rFonts w:ascii="Consolas" w:hAnsi="Consolas" w:cs="Consolas"/>
+          <w:color w:val="202020"/>
+          <w:sz w:val="20"/>
+        </w:rPr>
+        <w:t xml:space="preserve">    &lt;label for="password" style="color: #7fae5a"&gt;Password:&lt;/label&gt;&lt;br&gt;</w:t>
+        <w:br/>
+      </w:r>
+      <w:r>
+        <w:rPr>
+          <w:rFonts w:ascii="Consolas" w:hAnsi="Consolas" w:cs="Consolas"/>
+          <w:color w:val="202020"/>
+          <w:sz w:val="20"/>
+        </w:rPr>
+        <w:t xml:space="preserve">    &lt;input type="password" id="password" name="password" required&gt;&lt;br&gt;&lt;br&gt;</w:t>
         <w:br/>
       </w:r>
       <w:r>
@@ -1057,52 +796,25 @@
           <w:color w:val="202020"/>
           <w:sz w:val="20"/>
         </w:rPr>
-        <w:t xml:space="preserve">    fieldset {</w:t>
-        <w:br/>
-      </w:r>
-      <w:r>
-        <w:rPr>
-          <w:rFonts w:ascii="Consolas" w:hAnsi="Consolas" w:cs="Consolas"/>
-          <w:color w:val="202020"/>
-          <w:sz w:val="20"/>
-        </w:rPr>
-        <w:t xml:space="preserve">      border: 1px solid #3a3733;</w:t>
-        <w:br/>
-      </w:r>
-      <w:r>
-        <w:rPr>
-          <w:rFonts w:ascii="Consolas" w:hAnsi="Consolas" w:cs="Consolas"/>
-          <w:color w:val="202020"/>
-          <w:sz w:val="20"/>
-        </w:rPr>
-        <w:t xml:space="preserve">      border-radius: 6px;</w:t>
-        <w:br/>
-      </w:r>
-      <w:r>
-        <w:rPr>
-          <w:rFonts w:ascii="Consolas" w:hAnsi="Consolas" w:cs="Consolas"/>
-          <w:color w:val="202020"/>
-          <w:sz w:val="20"/>
-        </w:rPr>
-        <w:t xml:space="preserve">      margin-bottom: 22px;</w:t>
-        <w:br/>
-      </w:r>
-      <w:r>
-        <w:rPr>
-          <w:rFonts w:ascii="Consolas" w:hAnsi="Consolas" w:cs="Consolas"/>
-          <w:color w:val="202020"/>
-          <w:sz w:val="20"/>
-        </w:rPr>
-        <w:t xml:space="preserve">      padding: 18px 20px 22px;</w:t>
-        <w:br/>
-      </w:r>
-      <w:r>
-        <w:rPr>
-          <w:rFonts w:ascii="Consolas" w:hAnsi="Consolas" w:cs="Consolas"/>
-          <w:color w:val="202020"/>
-          <w:sz w:val="20"/>
-        </w:rPr>
-        <w:t xml:space="preserve">    }</w:t>
+        <w:t xml:space="preserve">    &lt;!-- Number --&gt;</w:t>
+        <w:br/>
+      </w:r>
+      <w:r>
+        <w:rPr>
+          <w:rFonts w:ascii="Consolas" w:hAnsi="Consolas" w:cs="Consolas"/>
+          <w:color w:val="202020"/>
+          <w:sz w:val="20"/>
+        </w:rPr>
+        <w:t xml:space="preserve">    &lt;label for="age" style="color: #7fae5a"&gt;Age:&lt;/label&gt;&lt;br&gt;</w:t>
+        <w:br/>
+      </w:r>
+      <w:r>
+        <w:rPr>
+          <w:rFonts w:ascii="Consolas" w:hAnsi="Consolas" w:cs="Consolas"/>
+          <w:color w:val="202020"/>
+          <w:sz w:val="20"/>
+        </w:rPr>
+        <w:t xml:space="preserve">    &lt;input type="number" id="age" name="age" min="13" max="99"&gt;&lt;br&gt;&lt;br&gt;</w:t>
         <w:br/>
       </w:r>
       <w:r>
@@ -1120,43 +832,25 @@
           <w:color w:val="202020"/>
           <w:sz w:val="20"/>
         </w:rPr>
-        <w:t xml:space="preserve">    legend {</w:t>
-        <w:br/>
-      </w:r>
-      <w:r>
-        <w:rPr>
-          <w:rFonts w:ascii="Consolas" w:hAnsi="Consolas" w:cs="Consolas"/>
-          <w:color w:val="202020"/>
-          <w:sz w:val="20"/>
-        </w:rPr>
-        <w:t xml:space="preserve">      color: var(--orange-soft);</w:t>
-        <w:br/>
-      </w:r>
-      <w:r>
-        <w:rPr>
-          <w:rFonts w:ascii="Consolas" w:hAnsi="Consolas" w:cs="Consolas"/>
-          <w:color w:val="202020"/>
-          <w:sz w:val="20"/>
-        </w:rPr>
-        <w:t xml:space="preserve">      font-weight: bold;</w:t>
-        <w:br/>
-      </w:r>
-      <w:r>
-        <w:rPr>
-          <w:rFonts w:ascii="Consolas" w:hAnsi="Consolas" w:cs="Consolas"/>
-          <w:color w:val="202020"/>
-          <w:sz w:val="20"/>
-        </w:rPr>
-        <w:t xml:space="preserve">      padding: 0 8px;</w:t>
-        <w:br/>
-      </w:r>
-      <w:r>
-        <w:rPr>
-          <w:rFonts w:ascii="Consolas" w:hAnsi="Consolas" w:cs="Consolas"/>
-          <w:color w:val="202020"/>
-          <w:sz w:val="20"/>
-        </w:rPr>
-        <w:t xml:space="preserve">    }</w:t>
+        <w:t xml:space="preserve">    &lt;!-- Date --&gt;</w:t>
+        <w:br/>
+      </w:r>
+      <w:r>
+        <w:rPr>
+          <w:rFonts w:ascii="Consolas" w:hAnsi="Consolas" w:cs="Consolas"/>
+          <w:color w:val="202020"/>
+          <w:sz w:val="20"/>
+        </w:rPr>
+        <w:t xml:space="preserve">    &lt;label for="dob" style="color: #7fae5a"&gt;Date of Birth:&lt;/label&gt;&lt;br&gt;</w:t>
+        <w:br/>
+      </w:r>
+      <w:r>
+        <w:rPr>
+          <w:rFonts w:ascii="Consolas" w:hAnsi="Consolas" w:cs="Consolas"/>
+          <w:color w:val="202020"/>
+          <w:sz w:val="20"/>
+        </w:rPr>
+        <w:t xml:space="preserve">    &lt;input type="date" id="dob" name="dob"&gt;&lt;br&gt;&lt;br&gt;</w:t>
         <w:br/>
       </w:r>
       <w:r>
@@ -1174,61 +868,43 @@
           <w:color w:val="202020"/>
           <w:sz w:val="20"/>
         </w:rPr>
-        <w:t xml:space="preserve">    label {</w:t>
-        <w:br/>
-      </w:r>
-      <w:r>
-        <w:rPr>
-          <w:rFonts w:ascii="Consolas" w:hAnsi="Consolas" w:cs="Consolas"/>
-          <w:color w:val="202020"/>
-          <w:sz w:val="20"/>
-        </w:rPr>
-        <w:t xml:space="preserve">      display: block;</w:t>
-        <w:br/>
-      </w:r>
-      <w:r>
-        <w:rPr>
-          <w:rFonts w:ascii="Consolas" w:hAnsi="Consolas" w:cs="Consolas"/>
-          <w:color w:val="202020"/>
-          <w:sz w:val="20"/>
-        </w:rPr>
-        <w:t xml:space="preserve">      margin-top: 14px;</w:t>
-        <w:br/>
-      </w:r>
-      <w:r>
-        <w:rPr>
-          <w:rFonts w:ascii="Consolas" w:hAnsi="Consolas" w:cs="Consolas"/>
-          <w:color w:val="202020"/>
-          <w:sz w:val="20"/>
-        </w:rPr>
-        <w:t xml:space="preserve">      margin-bottom: 4px;</w:t>
-        <w:br/>
-      </w:r>
-      <w:r>
-        <w:rPr>
-          <w:rFonts w:ascii="Consolas" w:hAnsi="Consolas" w:cs="Consolas"/>
-          <w:color w:val="202020"/>
-          <w:sz w:val="20"/>
-        </w:rPr>
-        <w:t xml:space="preserve">      font-size: 14px;</w:t>
-        <w:br/>
-      </w:r>
-      <w:r>
-        <w:rPr>
-          <w:rFonts w:ascii="Consolas" w:hAnsi="Consolas" w:cs="Consolas"/>
-          <w:color w:val="202020"/>
-          <w:sz w:val="20"/>
-        </w:rPr>
-        <w:t xml:space="preserve">      color: var(--text-dim);</w:t>
-        <w:br/>
-      </w:r>
-      <w:r>
-        <w:rPr>
-          <w:rFonts w:ascii="Consolas" w:hAnsi="Consolas" w:cs="Consolas"/>
-          <w:color w:val="202020"/>
-          <w:sz w:val="20"/>
-        </w:rPr>
-        <w:t xml:space="preserve">    }</w:t>
+        <w:t xml:space="preserve">    &lt;!-- Radio Buttons --&gt;</w:t>
+        <w:br/>
+      </w:r>
+      <w:r>
+        <w:rPr>
+          <w:rFonts w:ascii="Consolas" w:hAnsi="Consolas" w:cs="Consolas"/>
+          <w:color w:val="202020"/>
+          <w:sz w:val="20"/>
+        </w:rPr>
+        <w:t xml:space="preserve">    &lt;label style="color: #7fae5a"&gt;Main Platform:&lt;/label&gt;&lt;br&gt;</w:t>
+        <w:br/>
+      </w:r>
+      <w:r>
+        <w:rPr>
+          <w:rFonts w:ascii="Consolas" w:hAnsi="Consolas" w:cs="Consolas"/>
+          <w:color w:val="202020"/>
+          <w:sz w:val="20"/>
+        </w:rPr>
+        <w:t xml:space="preserve">    &lt;input type="radio" name="platform" value="pc"&gt; PC</w:t>
+        <w:br/>
+      </w:r>
+      <w:r>
+        <w:rPr>
+          <w:rFonts w:ascii="Consolas" w:hAnsi="Consolas" w:cs="Consolas"/>
+          <w:color w:val="202020"/>
+          <w:sz w:val="20"/>
+        </w:rPr>
+        <w:t xml:space="preserve">    &lt;input type="radio" name="platform" value="console"&gt; Console</w:t>
+        <w:br/>
+      </w:r>
+      <w:r>
+        <w:rPr>
+          <w:rFonts w:ascii="Consolas" w:hAnsi="Consolas" w:cs="Consolas"/>
+          <w:color w:val="202020"/>
+          <w:sz w:val="20"/>
+        </w:rPr>
+        <w:t xml:space="preserve">    &lt;input type="radio" name="platform" value="mobile"&gt; Mobile&lt;br&gt;&lt;br&gt;</w:t>
         <w:br/>
       </w:r>
       <w:r>
@@ -1246,79 +922,52 @@
           <w:color w:val="202020"/>
           <w:sz w:val="20"/>
         </w:rPr>
-        <w:t xml:space="preserve">    input, select {</w:t>
-        <w:br/>
-      </w:r>
-      <w:r>
-        <w:rPr>
-          <w:rFonts w:ascii="Consolas" w:hAnsi="Consolas" w:cs="Consolas"/>
-          <w:color w:val="202020"/>
-          <w:sz w:val="20"/>
-        </w:rPr>
-        <w:t xml:space="preserve">      background-color: var(--panel);</w:t>
-        <w:br/>
-      </w:r>
-      <w:r>
-        <w:rPr>
-          <w:rFonts w:ascii="Consolas" w:hAnsi="Consolas" w:cs="Consolas"/>
-          <w:color w:val="202020"/>
-          <w:sz w:val="20"/>
-        </w:rPr>
-        <w:t xml:space="preserve">      border: 1px solid #3a3733;</w:t>
-        <w:br/>
-      </w:r>
-      <w:r>
-        <w:rPr>
-          <w:rFonts w:ascii="Consolas" w:hAnsi="Consolas" w:cs="Consolas"/>
-          <w:color w:val="202020"/>
-          <w:sz w:val="20"/>
-        </w:rPr>
-        <w:t xml:space="preserve">      border-radius: 4px;</w:t>
-        <w:br/>
-      </w:r>
-      <w:r>
-        <w:rPr>
-          <w:rFonts w:ascii="Consolas" w:hAnsi="Consolas" w:cs="Consolas"/>
-          <w:color w:val="202020"/>
-          <w:sz w:val="20"/>
-        </w:rPr>
-        <w:t xml:space="preserve">      color: var(--text);</w:t>
-        <w:br/>
-      </w:r>
-      <w:r>
-        <w:rPr>
-          <w:rFonts w:ascii="Consolas" w:hAnsi="Consolas" w:cs="Consolas"/>
-          <w:color w:val="202020"/>
-          <w:sz w:val="20"/>
-        </w:rPr>
-        <w:t xml:space="preserve">      padding: 8px 10px;</w:t>
-        <w:br/>
-      </w:r>
-      <w:r>
-        <w:rPr>
-          <w:rFonts w:ascii="Consolas" w:hAnsi="Consolas" w:cs="Consolas"/>
-          <w:color w:val="202020"/>
-          <w:sz w:val="20"/>
-        </w:rPr>
-        <w:t xml:space="preserve">      font-size: 14px;</w:t>
-        <w:br/>
-      </w:r>
-      <w:r>
-        <w:rPr>
-          <w:rFonts w:ascii="Consolas" w:hAnsi="Consolas" w:cs="Consolas"/>
-          <w:color w:val="202020"/>
-          <w:sz w:val="20"/>
-        </w:rPr>
-        <w:t xml:space="preserve">      width: 100%;</w:t>
-        <w:br/>
-      </w:r>
-      <w:r>
-        <w:rPr>
-          <w:rFonts w:ascii="Consolas" w:hAnsi="Consolas" w:cs="Consolas"/>
-          <w:color w:val="202020"/>
-          <w:sz w:val="20"/>
-        </w:rPr>
-        <w:t xml:space="preserve">    }</w:t>
+        <w:t xml:space="preserve">    &lt;!-- Checkbox --&gt;</w:t>
+        <w:br/>
+      </w:r>
+      <w:r>
+        <w:rPr>
+          <w:rFonts w:ascii="Consolas" w:hAnsi="Consolas" w:cs="Consolas"/>
+          <w:color w:val="202020"/>
+          <w:sz w:val="20"/>
+        </w:rPr>
+        <w:t xml:space="preserve">    &lt;label style="color: #7fae5a"&gt;Games You Play:&lt;/label&gt;&lt;br&gt;</w:t>
+        <w:br/>
+      </w:r>
+      <w:r>
+        <w:rPr>
+          <w:rFonts w:ascii="Consolas" w:hAnsi="Consolas" w:cs="Consolas"/>
+          <w:color w:val="202020"/>
+          <w:sz w:val="20"/>
+        </w:rPr>
+        <w:t xml:space="preserve">    &lt;input type="checkbox" name="games" value="battle-royale"&gt; Battle Royale</w:t>
+        <w:br/>
+      </w:r>
+      <w:r>
+        <w:rPr>
+          <w:rFonts w:ascii="Consolas" w:hAnsi="Consolas" w:cs="Consolas"/>
+          <w:color w:val="202020"/>
+          <w:sz w:val="20"/>
+        </w:rPr>
+        <w:t xml:space="preserve">    &lt;input type="checkbox" name="games" value="racing"&gt; Racing</w:t>
+        <w:br/>
+      </w:r>
+      <w:r>
+        <w:rPr>
+          <w:rFonts w:ascii="Consolas" w:hAnsi="Consolas" w:cs="Consolas"/>
+          <w:color w:val="202020"/>
+          <w:sz w:val="20"/>
+        </w:rPr>
+        <w:t xml:space="preserve">    &lt;input type="checkbox" name="games" value="mmorpg"&gt; MMORPG</w:t>
+        <w:br/>
+      </w:r>
+      <w:r>
+        <w:rPr>
+          <w:rFonts w:ascii="Consolas" w:hAnsi="Consolas" w:cs="Consolas"/>
+          <w:color w:val="202020"/>
+          <w:sz w:val="20"/>
+        </w:rPr>
+        <w:t xml:space="preserve">    &lt;input type="checkbox" name="games" value="fps"&gt; FPS&lt;br&gt;&lt;br&gt;</w:t>
         <w:br/>
       </w:r>
       <w:r>
@@ -1336,34 +985,70 @@
           <w:color w:val="202020"/>
           <w:sz w:val="20"/>
         </w:rPr>
-        <w:t xml:space="preserve">    input:focus, select:focus {</w:t>
-        <w:br/>
-      </w:r>
-      <w:r>
-        <w:rPr>
-          <w:rFonts w:ascii="Consolas" w:hAnsi="Consolas" w:cs="Consolas"/>
-          <w:color w:val="202020"/>
-          <w:sz w:val="20"/>
-        </w:rPr>
-        <w:t xml:space="preserve">      outline: none;</w:t>
-        <w:br/>
-      </w:r>
-      <w:r>
-        <w:rPr>
-          <w:rFonts w:ascii="Consolas" w:hAnsi="Consolas" w:cs="Consolas"/>
-          <w:color w:val="202020"/>
-          <w:sz w:val="20"/>
-        </w:rPr>
-        <w:t xml:space="preserve">      border-color: var(--orange);</w:t>
-        <w:br/>
-      </w:r>
-      <w:r>
-        <w:rPr>
-          <w:rFonts w:ascii="Consolas" w:hAnsi="Consolas" w:cs="Consolas"/>
-          <w:color w:val="202020"/>
-          <w:sz w:val="20"/>
-        </w:rPr>
-        <w:t xml:space="preserve">    }</w:t>
+        <w:t xml:space="preserve">    &lt;!-- Dropdown --&gt;</w:t>
+        <w:br/>
+      </w:r>
+      <w:r>
+        <w:rPr>
+          <w:rFonts w:ascii="Consolas" w:hAnsi="Consolas" w:cs="Consolas"/>
+          <w:color w:val="202020"/>
+          <w:sz w:val="20"/>
+        </w:rPr>
+        <w:t xml:space="preserve">    &lt;label for="heard" style="color: #7fae5a"&gt;How Did You Hear About Us:&lt;/label&gt;&lt;br&gt;</w:t>
+        <w:br/>
+      </w:r>
+      <w:r>
+        <w:rPr>
+          <w:rFonts w:ascii="Consolas" w:hAnsi="Consolas" w:cs="Consolas"/>
+          <w:color w:val="202020"/>
+          <w:sz w:val="20"/>
+        </w:rPr>
+        <w:t xml:space="preserve">    &lt;select id="heard" name="heard"&gt;</w:t>
+        <w:br/>
+      </w:r>
+      <w:r>
+        <w:rPr>
+          <w:rFonts w:ascii="Consolas" w:hAnsi="Consolas" w:cs="Consolas"/>
+          <w:color w:val="202020"/>
+          <w:sz w:val="20"/>
+        </w:rPr>
+        <w:t xml:space="preserve">      &lt;option value="friend"&gt;A friend told me&lt;/option&gt;</w:t>
+        <w:br/>
+      </w:r>
+      <w:r>
+        <w:rPr>
+          <w:rFonts w:ascii="Consolas" w:hAnsi="Consolas" w:cs="Consolas"/>
+          <w:color w:val="202020"/>
+          <w:sz w:val="20"/>
+        </w:rPr>
+        <w:t xml:space="preserve">      &lt;option value="youtube"&gt;YouTube&lt;/option&gt;</w:t>
+        <w:br/>
+      </w:r>
+      <w:r>
+        <w:rPr>
+          <w:rFonts w:ascii="Consolas" w:hAnsi="Consolas" w:cs="Consolas"/>
+          <w:color w:val="202020"/>
+          <w:sz w:val="20"/>
+        </w:rPr>
+        <w:t xml:space="preserve">      &lt;option value="reddit"&gt;Reddit&lt;/option&gt;</w:t>
+        <w:br/>
+      </w:r>
+      <w:r>
+        <w:rPr>
+          <w:rFonts w:ascii="Consolas" w:hAnsi="Consolas" w:cs="Consolas"/>
+          <w:color w:val="202020"/>
+          <w:sz w:val="20"/>
+        </w:rPr>
+        <w:t xml:space="preserve">      &lt;option value="discord"&gt;Another Discord server&lt;/option&gt;</w:t>
+        <w:br/>
+      </w:r>
+      <w:r>
+        <w:rPr>
+          <w:rFonts w:ascii="Consolas" w:hAnsi="Consolas" w:cs="Consolas"/>
+          <w:color w:val="202020"/>
+          <w:sz w:val="20"/>
+        </w:rPr>
+        <w:t xml:space="preserve">    &lt;/select&gt;&lt;br&gt;&lt;br&gt;</w:t>
         <w:br/>
       </w:r>
       <w:r>
@@ -1381,61 +1066,79 @@
           <w:color w:val="202020"/>
           <w:sz w:val="20"/>
         </w:rPr>
-        <w:t xml:space="preserve">    .inline-group label {</w:t>
-        <w:br/>
-      </w:r>
-      <w:r>
-        <w:rPr>
-          <w:rFonts w:ascii="Consolas" w:hAnsi="Consolas" w:cs="Consolas"/>
-          <w:color w:val="202020"/>
-          <w:sz w:val="20"/>
-        </w:rPr>
-        <w:t xml:space="preserve">      display: inline-block;</w:t>
-        <w:br/>
-      </w:r>
-      <w:r>
-        <w:rPr>
-          <w:rFonts w:ascii="Consolas" w:hAnsi="Consolas" w:cs="Consolas"/>
-          <w:color w:val="202020"/>
-          <w:sz w:val="20"/>
-        </w:rPr>
-        <w:t xml:space="preserve">      margin-right: 18px;</w:t>
-        <w:br/>
-      </w:r>
-      <w:r>
-        <w:rPr>
-          <w:rFonts w:ascii="Consolas" w:hAnsi="Consolas" w:cs="Consolas"/>
-          <w:color w:val="202020"/>
-          <w:sz w:val="20"/>
-        </w:rPr>
-        <w:t xml:space="preserve">      margin-top: 0;</w:t>
-        <w:br/>
-      </w:r>
-      <w:r>
-        <w:rPr>
-          <w:rFonts w:ascii="Consolas" w:hAnsi="Consolas" w:cs="Consolas"/>
-          <w:color w:val="202020"/>
-          <w:sz w:val="20"/>
-        </w:rPr>
-        <w:t xml:space="preserve">      color: var(--text);</w:t>
-        <w:br/>
-      </w:r>
-      <w:r>
-        <w:rPr>
-          <w:rFonts w:ascii="Consolas" w:hAnsi="Consolas" w:cs="Consolas"/>
-          <w:color w:val="202020"/>
-          <w:sz w:val="20"/>
-        </w:rPr>
-        <w:t xml:space="preserve">      font-size: 14px;</w:t>
-        <w:br/>
-      </w:r>
-      <w:r>
-        <w:rPr>
-          <w:rFonts w:ascii="Consolas" w:hAnsi="Consolas" w:cs="Consolas"/>
-          <w:color w:val="202020"/>
-          <w:sz w:val="20"/>
-        </w:rPr>
-        <w:t xml:space="preserve">    }</w:t>
+        <w:t xml:space="preserve">    &lt;!-- Datalist --&gt;</w:t>
+        <w:br/>
+      </w:r>
+      <w:r>
+        <w:rPr>
+          <w:rFonts w:ascii="Consolas" w:hAnsi="Consolas" w:cs="Consolas"/>
+          <w:color w:val="202020"/>
+          <w:sz w:val="20"/>
+        </w:rPr>
+        <w:t xml:space="preserve">    &lt;label for="region" style="color: #7fae5a"&gt;Closest Server Region:&lt;/label&gt;&lt;br&gt;</w:t>
+        <w:br/>
+      </w:r>
+      <w:r>
+        <w:rPr>
+          <w:rFonts w:ascii="Consolas" w:hAnsi="Consolas" w:cs="Consolas"/>
+          <w:color w:val="202020"/>
+          <w:sz w:val="20"/>
+        </w:rPr>
+        <w:t xml:space="preserve">    &lt;input list="regions" name="region" id="region"&gt;</w:t>
+        <w:br/>
+      </w:r>
+      <w:r>
+        <w:rPr>
+          <w:rFonts w:ascii="Consolas" w:hAnsi="Consolas" w:cs="Consolas"/>
+          <w:color w:val="202020"/>
+          <w:sz w:val="20"/>
+        </w:rPr>
+        <w:t xml:space="preserve">    &lt;datalist id="regions"&gt;</w:t>
+        <w:br/>
+      </w:r>
+      <w:r>
+        <w:rPr>
+          <w:rFonts w:ascii="Consolas" w:hAnsi="Consolas" w:cs="Consolas"/>
+          <w:color w:val="202020"/>
+          <w:sz w:val="20"/>
+        </w:rPr>
+        <w:t xml:space="preserve">      &lt;option value="Mumbai"&gt;</w:t>
+        <w:br/>
+      </w:r>
+      <w:r>
+        <w:rPr>
+          <w:rFonts w:ascii="Consolas" w:hAnsi="Consolas" w:cs="Consolas"/>
+          <w:color w:val="202020"/>
+          <w:sz w:val="20"/>
+        </w:rPr>
+        <w:t xml:space="preserve">      &lt;option value="Chennai"&gt;</w:t>
+        <w:br/>
+      </w:r>
+      <w:r>
+        <w:rPr>
+          <w:rFonts w:ascii="Consolas" w:hAnsi="Consolas" w:cs="Consolas"/>
+          <w:color w:val="202020"/>
+          <w:sz w:val="20"/>
+        </w:rPr>
+        <w:t xml:space="preserve">      &lt;option value="Bangalore"&gt;</w:t>
+        <w:br/>
+      </w:r>
+      <w:r>
+        <w:rPr>
+          <w:rFonts w:ascii="Consolas" w:hAnsi="Consolas" w:cs="Consolas"/>
+          <w:color w:val="202020"/>
+          <w:sz w:val="20"/>
+        </w:rPr>
+        <w:t xml:space="preserve">      &lt;option value="Singapore"&gt;</w:t>
+        <w:br/>
+      </w:r>
+      <w:r>
+        <w:rPr>
+          <w:rFonts w:ascii="Consolas" w:hAnsi="Consolas" w:cs="Consolas"/>
+          <w:color w:val="202020"/>
+          <w:sz w:val="20"/>
+        </w:rPr>
+        <w:t xml:space="preserve">    &lt;/datalist&gt;&lt;br&gt;&lt;br&gt;</w:t>
         <w:br/>
       </w:r>
       <w:r>
@@ -1453,34 +1156,25 @@
           <w:color w:val="202020"/>
           <w:sz w:val="20"/>
         </w:rPr>
-        <w:t xml:space="preserve">    .inline-group input {</w:t>
-        <w:br/>
-      </w:r>
-      <w:r>
-        <w:rPr>
-          <w:rFonts w:ascii="Consolas" w:hAnsi="Consolas" w:cs="Consolas"/>
-          <w:color w:val="202020"/>
-          <w:sz w:val="20"/>
-        </w:rPr>
-        <w:t xml:space="preserve">      width: auto;</w:t>
-        <w:br/>
-      </w:r>
-      <w:r>
-        <w:rPr>
-          <w:rFonts w:ascii="Consolas" w:hAnsi="Consolas" w:cs="Consolas"/>
-          <w:color w:val="202020"/>
-          <w:sz w:val="20"/>
-        </w:rPr>
-        <w:t xml:space="preserve">      margin-right: 6px;</w:t>
-        <w:br/>
-      </w:r>
-      <w:r>
-        <w:rPr>
-          <w:rFonts w:ascii="Consolas" w:hAnsi="Consolas" w:cs="Consolas"/>
-          <w:color w:val="202020"/>
-          <w:sz w:val="20"/>
-        </w:rPr>
-        <w:t xml:space="preserve">    }</w:t>
+        <w:t xml:space="preserve">    &lt;!-- Range --&gt;</w:t>
+        <w:br/>
+      </w:r>
+      <w:r>
+        <w:rPr>
+          <w:rFonts w:ascii="Consolas" w:hAnsi="Consolas" w:cs="Consolas"/>
+          <w:color w:val="202020"/>
+          <w:sz w:val="20"/>
+        </w:rPr>
+        <w:t xml:space="preserve">    &lt;label for="rating" style="color: #7fae5a"&gt;Rate Your Skill Level:&lt;/label&gt;&lt;br&gt;</w:t>
+        <w:br/>
+      </w:r>
+      <w:r>
+        <w:rPr>
+          <w:rFonts w:ascii="Consolas" w:hAnsi="Consolas" w:cs="Consolas"/>
+          <w:color w:val="202020"/>
+          <w:sz w:val="20"/>
+        </w:rPr>
+        <w:t xml:space="preserve">    &lt;input type="range" id="rating" name="rating" min="1" max="10"&gt;&lt;br&gt;&lt;br&gt;</w:t>
         <w:br/>
       </w:r>
       <w:r>
@@ -1498,25 +1192,25 @@
           <w:color w:val="202020"/>
           <w:sz w:val="20"/>
         </w:rPr>
-        <w:t xml:space="preserve">    input[type="range"] {</w:t>
-        <w:br/>
-      </w:r>
-      <w:r>
-        <w:rPr>
-          <w:rFonts w:ascii="Consolas" w:hAnsi="Consolas" w:cs="Consolas"/>
-          <w:color w:val="202020"/>
-          <w:sz w:val="20"/>
-        </w:rPr>
-        <w:t xml:space="preserve">      padding: 0;</w:t>
-        <w:br/>
-      </w:r>
-      <w:r>
-        <w:rPr>
-          <w:rFonts w:ascii="Consolas" w:hAnsi="Consolas" w:cs="Consolas"/>
-          <w:color w:val="202020"/>
-          <w:sz w:val="20"/>
-        </w:rPr>
-        <w:t xml:space="preserve">    }</w:t>
+        <w:t xml:space="preserve">    &lt;!-- Color --&gt;</w:t>
+        <w:br/>
+      </w:r>
+      <w:r>
+        <w:rPr>
+          <w:rFonts w:ascii="Consolas" w:hAnsi="Consolas" w:cs="Consolas"/>
+          <w:color w:val="202020"/>
+          <w:sz w:val="20"/>
+        </w:rPr>
+        <w:t xml:space="preserve">    &lt;label for="accent" style="color: #7fae5a"&gt;Profile Accent Color:&lt;/label&gt;&lt;br&gt;</w:t>
+        <w:br/>
+      </w:r>
+      <w:r>
+        <w:rPr>
+          <w:rFonts w:ascii="Consolas" w:hAnsi="Consolas" w:cs="Consolas"/>
+          <w:color w:val="202020"/>
+          <w:sz w:val="20"/>
+        </w:rPr>
+        <w:t xml:space="preserve">    &lt;input type="color" id="accent" name="accent" value="#e8792c"&gt;&lt;br&gt;&lt;br&gt;</w:t>
         <w:br/>
       </w:r>
       <w:r>
@@ -1534,43 +1228,16 @@
           <w:color w:val="202020"/>
           <w:sz w:val="20"/>
         </w:rPr>
-        <w:t xml:space="preserve">    input[type="color"] {</w:t>
-        <w:br/>
-      </w:r>
-      <w:r>
-        <w:rPr>
-          <w:rFonts w:ascii="Consolas" w:hAnsi="Consolas" w:cs="Consolas"/>
-          <w:color w:val="202020"/>
-          <w:sz w:val="20"/>
-        </w:rPr>
-        <w:t xml:space="preserve">      width: 60px;</w:t>
-        <w:br/>
-      </w:r>
-      <w:r>
-        <w:rPr>
-          <w:rFonts w:ascii="Consolas" w:hAnsi="Consolas" w:cs="Consolas"/>
-          <w:color w:val="202020"/>
-          <w:sz w:val="20"/>
-        </w:rPr>
-        <w:t xml:space="preserve">      padding: 2px;</w:t>
-        <w:br/>
-      </w:r>
-      <w:r>
-        <w:rPr>
-          <w:rFonts w:ascii="Consolas" w:hAnsi="Consolas" w:cs="Consolas"/>
-          <w:color w:val="202020"/>
-          <w:sz w:val="20"/>
-        </w:rPr>
-        <w:t xml:space="preserve">      cursor: pointer;</w:t>
-        <w:br/>
-      </w:r>
-      <w:r>
-        <w:rPr>
-          <w:rFonts w:ascii="Consolas" w:hAnsi="Consolas" w:cs="Consolas"/>
-          <w:color w:val="202020"/>
-          <w:sz w:val="20"/>
-        </w:rPr>
-        <w:t xml:space="preserve">    }</w:t>
+        <w:t xml:space="preserve">    &lt;!-- Submit --&gt;</w:t>
+        <w:br/>
+      </w:r>
+      <w:r>
+        <w:rPr>
+          <w:rFonts w:ascii="Consolas" w:hAnsi="Consolas" w:cs="Consolas"/>
+          <w:color w:val="202020"/>
+          <w:sz w:val="20"/>
+        </w:rPr>
+        <w:t xml:space="preserve">    &lt;button type="submit"&gt;Create Account&lt;/button&gt;</w:t>
         <w:br/>
       </w:r>
       <w:r>
@@ -1588,106 +1255,7 @@
           <w:color w:val="202020"/>
           <w:sz w:val="20"/>
         </w:rPr>
-        <w:t xml:space="preserve">    button {</w:t>
-        <w:br/>
-      </w:r>
-      <w:r>
-        <w:rPr>
-          <w:rFonts w:ascii="Consolas" w:hAnsi="Consolas" w:cs="Consolas"/>
-          <w:color w:val="202020"/>
-          <w:sz w:val="20"/>
-        </w:rPr>
-        <w:t xml:space="preserve">      background-color: var(--orange);</w:t>
-        <w:br/>
-      </w:r>
-      <w:r>
-        <w:rPr>
-          <w:rFonts w:ascii="Consolas" w:hAnsi="Consolas" w:cs="Consolas"/>
-          <w:color w:val="202020"/>
-          <w:sz w:val="20"/>
-        </w:rPr>
-        <w:t xml:space="preserve">      color: #1c1b18;</w:t>
-        <w:br/>
-      </w:r>
-      <w:r>
-        <w:rPr>
-          <w:rFonts w:ascii="Consolas" w:hAnsi="Consolas" w:cs="Consolas"/>
-          <w:color w:val="202020"/>
-          <w:sz w:val="20"/>
-        </w:rPr>
-        <w:t xml:space="preserve">      border: none;</w:t>
-        <w:br/>
-      </w:r>
-      <w:r>
-        <w:rPr>
-          <w:rFonts w:ascii="Consolas" w:hAnsi="Consolas" w:cs="Consolas"/>
-          <w:color w:val="202020"/>
-          <w:sz w:val="20"/>
-        </w:rPr>
-        <w:t xml:space="preserve">      border-radius: 5px;</w:t>
-        <w:br/>
-      </w:r>
-      <w:r>
-        <w:rPr>
-          <w:rFonts w:ascii="Consolas" w:hAnsi="Consolas" w:cs="Consolas"/>
-          <w:color w:val="202020"/>
-          <w:sz w:val="20"/>
-        </w:rPr>
-        <w:t xml:space="preserve">      padding: 12px 20px;</w:t>
-        <w:br/>
-      </w:r>
-      <w:r>
-        <w:rPr>
-          <w:rFonts w:ascii="Consolas" w:hAnsi="Consolas" w:cs="Consolas"/>
-          <w:color w:val="202020"/>
-          <w:sz w:val="20"/>
-        </w:rPr>
-        <w:t xml:space="preserve">      font-size: 15px;</w:t>
-        <w:br/>
-      </w:r>
-      <w:r>
-        <w:rPr>
-          <w:rFonts w:ascii="Consolas" w:hAnsi="Consolas" w:cs="Consolas"/>
-          <w:color w:val="202020"/>
-          <w:sz w:val="20"/>
-        </w:rPr>
-        <w:t xml:space="preserve">      font-weight: bold;</w:t>
-        <w:br/>
-      </w:r>
-      <w:r>
-        <w:rPr>
-          <w:rFonts w:ascii="Consolas" w:hAnsi="Consolas" w:cs="Consolas"/>
-          <w:color w:val="202020"/>
-          <w:sz w:val="20"/>
-        </w:rPr>
-        <w:t xml:space="preserve">      margin-top: 26px;</w:t>
-        <w:br/>
-      </w:r>
-      <w:r>
-        <w:rPr>
-          <w:rFonts w:ascii="Consolas" w:hAnsi="Consolas" w:cs="Consolas"/>
-          <w:color w:val="202020"/>
-          <w:sz w:val="20"/>
-        </w:rPr>
-        <w:t xml:space="preserve">      width: 100%;</w:t>
-        <w:br/>
-      </w:r>
-      <w:r>
-        <w:rPr>
-          <w:rFonts w:ascii="Consolas" w:hAnsi="Consolas" w:cs="Consolas"/>
-          <w:color w:val="202020"/>
-          <w:sz w:val="20"/>
-        </w:rPr>
-        <w:t xml:space="preserve">      cursor: pointer;</w:t>
-        <w:br/>
-      </w:r>
-      <w:r>
-        <w:rPr>
-          <w:rFonts w:ascii="Consolas" w:hAnsi="Consolas" w:cs="Consolas"/>
-          <w:color w:val="202020"/>
-          <w:sz w:val="20"/>
-        </w:rPr>
-        <w:t xml:space="preserve">    }</w:t>
+        <w:t xml:space="preserve">  &lt;/form&gt;</w:t>
         <w:br/>
       </w:r>
       <w:r>
@@ -1705,25 +1273,7 @@
           <w:color w:val="202020"/>
           <w:sz w:val="20"/>
         </w:rPr>
-        <w:t xml:space="preserve">    button:hover {</w:t>
-        <w:br/>
-      </w:r>
-      <w:r>
-        <w:rPr>
-          <w:rFonts w:ascii="Consolas" w:hAnsi="Consolas" w:cs="Consolas"/>
-          <w:color w:val="202020"/>
-          <w:sz w:val="20"/>
-        </w:rPr>
-        <w:t xml:space="preserve">      background-color: var(--orange-soft);</w:t>
-        <w:br/>
-      </w:r>
-      <w:r>
-        <w:rPr>
-          <w:rFonts w:ascii="Consolas" w:hAnsi="Consolas" w:cs="Consolas"/>
-          <w:color w:val="202020"/>
-          <w:sz w:val="20"/>
-        </w:rPr>
-        <w:t xml:space="preserve">    }</w:t>
+        <w:t xml:space="preserve">  &lt;hr style="color: #e8792c"&gt;</w:t>
         <w:br/>
       </w:r>
       <w:r>
@@ -1741,898 +1291,25 @@
           <w:color w:val="202020"/>
           <w:sz w:val="20"/>
         </w:rPr>
-        <w:t xml:space="preserve">    footer {</w:t>
-        <w:br/>
-      </w:r>
-      <w:r>
-        <w:rPr>
-          <w:rFonts w:ascii="Consolas" w:hAnsi="Consolas" w:cs="Consolas"/>
-          <w:color w:val="202020"/>
-          <w:sz w:val="20"/>
-        </w:rPr>
-        <w:t xml:space="preserve">      text-align: center;</w:t>
-        <w:br/>
-      </w:r>
-      <w:r>
-        <w:rPr>
-          <w:rFonts w:ascii="Consolas" w:hAnsi="Consolas" w:cs="Consolas"/>
-          <w:color w:val="202020"/>
-          <w:sz w:val="20"/>
-        </w:rPr>
-        <w:t xml:space="preserve">      padding: 20px;</w:t>
-        <w:br/>
-      </w:r>
-      <w:r>
-        <w:rPr>
-          <w:rFonts w:ascii="Consolas" w:hAnsi="Consolas" w:cs="Consolas"/>
-          <w:color w:val="202020"/>
-          <w:sz w:val="20"/>
-        </w:rPr>
-        <w:t xml:space="preserve">      color: var(--text-dim);</w:t>
-        <w:br/>
-      </w:r>
-      <w:r>
-        <w:rPr>
-          <w:rFonts w:ascii="Consolas" w:hAnsi="Consolas" w:cs="Consolas"/>
-          <w:color w:val="202020"/>
-          <w:sz w:val="20"/>
-        </w:rPr>
-        <w:t xml:space="preserve">      font-size: 13px;</w:t>
-        <w:br/>
-      </w:r>
-      <w:r>
-        <w:rPr>
-          <w:rFonts w:ascii="Consolas" w:hAnsi="Consolas" w:cs="Consolas"/>
-          <w:color w:val="202020"/>
-          <w:sz w:val="20"/>
-        </w:rPr>
-        <w:t xml:space="preserve">      border-top: 1px solid #3a3733;</w:t>
-        <w:br/>
-      </w:r>
-      <w:r>
-        <w:rPr>
-          <w:rFonts w:ascii="Consolas" w:hAnsi="Consolas" w:cs="Consolas"/>
-          <w:color w:val="202020"/>
-          <w:sz w:val="20"/>
-        </w:rPr>
-        <w:t xml:space="preserve">    }</w:t>
-        <w:br/>
-      </w:r>
-      <w:r>
-        <w:rPr>
-          <w:rFonts w:ascii="Consolas" w:hAnsi="Consolas" w:cs="Consolas"/>
-          <w:color w:val="202020"/>
-          <w:sz w:val="20"/>
-        </w:rPr>
-        <w:t xml:space="preserve">  &lt;/style&gt;</w:t>
-        <w:br/>
-      </w:r>
-      <w:r>
-        <w:rPr>
-          <w:rFonts w:ascii="Consolas" w:hAnsi="Consolas" w:cs="Consolas"/>
-          <w:color w:val="202020"/>
-          <w:sz w:val="20"/>
-        </w:rPr>
-        <w:t>&lt;/head&gt;</w:t>
-        <w:br/>
-      </w:r>
-      <w:r>
-        <w:rPr>
-          <w:rFonts w:ascii="Consolas" w:hAnsi="Consolas" w:cs="Consolas"/>
-          <w:color w:val="202020"/>
-          <w:sz w:val="20"/>
-        </w:rPr>
-        <w:t>&lt;body&gt;</w:t>
-        <w:br/>
-      </w:r>
-      <w:r>
-        <w:rPr>
-          <w:rFonts w:ascii="Consolas" w:hAnsi="Consolas" w:cs="Consolas"/>
-          <w:color w:val="202020"/>
-          <w:sz w:val="20"/>
-        </w:rPr>
-        <w:t xml:space="preserve"> </w:t>
-        <w:br/>
-      </w:r>
-      <w:r>
-        <w:rPr>
-          <w:rFonts w:ascii="Consolas" w:hAnsi="Consolas" w:cs="Consolas"/>
-          <w:color w:val="202020"/>
-          <w:sz w:val="20"/>
-        </w:rPr>
-        <w:t xml:space="preserve">  &lt;!-- simple header linking back to the Ex1 homepage --&gt;</w:t>
-        <w:br/>
-      </w:r>
-      <w:r>
-        <w:rPr>
-          <w:rFonts w:ascii="Consolas" w:hAnsi="Consolas" w:cs="Consolas"/>
-          <w:color w:val="202020"/>
-          <w:sz w:val="20"/>
-        </w:rPr>
-        <w:t xml:space="preserve">  &lt;header&gt;</w:t>
-        <w:br/>
-      </w:r>
-      <w:r>
-        <w:rPr>
-          <w:rFonts w:ascii="Consolas" w:hAnsi="Consolas" w:cs="Consolas"/>
-          <w:color w:val="202020"/>
-          <w:sz w:val="20"/>
-        </w:rPr>
-        <w:t xml:space="preserve">    &lt;a href="../Ex1/index.html"&gt;&amp;larr; Back to Respawn Point&lt;/a&gt;</w:t>
-        <w:br/>
-      </w:r>
-      <w:r>
-        <w:rPr>
-          <w:rFonts w:ascii="Consolas" w:hAnsi="Consolas" w:cs="Consolas"/>
-          <w:color w:val="202020"/>
-          <w:sz w:val="20"/>
-        </w:rPr>
-        <w:t xml:space="preserve">  &lt;/header&gt;</w:t>
-        <w:br/>
-      </w:r>
-      <w:r>
-        <w:rPr>
-          <w:rFonts w:ascii="Consolas" w:hAnsi="Consolas" w:cs="Consolas"/>
-          <w:color w:val="202020"/>
-          <w:sz w:val="20"/>
-        </w:rPr>
-        <w:t xml:space="preserve"> </w:t>
-        <w:br/>
-      </w:r>
-      <w:r>
-        <w:rPr>
-          <w:rFonts w:ascii="Consolas" w:hAnsi="Consolas" w:cs="Consolas"/>
-          <w:color w:val="202020"/>
-          <w:sz w:val="20"/>
-        </w:rPr>
-        <w:t xml:space="preserve">  &lt;div class="wrap"&gt;</w:t>
-        <w:br/>
-      </w:r>
-      <w:r>
-        <w:rPr>
-          <w:rFonts w:ascii="Consolas" w:hAnsi="Consolas" w:cs="Consolas"/>
-          <w:color w:val="202020"/>
-          <w:sz w:val="20"/>
-        </w:rPr>
-        <w:t xml:space="preserve">    &lt;h1&gt;Join the Squad&lt;/h1&gt;</w:t>
-        <w:br/>
-      </w:r>
-      <w:r>
-        <w:rPr>
-          <w:rFonts w:ascii="Consolas" w:hAnsi="Consolas" w:cs="Consolas"/>
-          <w:color w:val="202020"/>
-          <w:sz w:val="20"/>
-        </w:rPr>
-        <w:t xml:space="preserve">    &lt;p class="subtitle"&gt;fill this in and you're one step closer to not solo queuing anymore&lt;/p&gt;</w:t>
-        <w:br/>
-      </w:r>
-      <w:r>
-        <w:rPr>
-          <w:rFonts w:ascii="Consolas" w:hAnsi="Consolas" w:cs="Consolas"/>
-          <w:color w:val="202020"/>
-          <w:sz w:val="20"/>
-        </w:rPr>
-        <w:t xml:space="preserve"> </w:t>
-        <w:br/>
-      </w:r>
-      <w:r>
-        <w:rPr>
-          <w:rFonts w:ascii="Consolas" w:hAnsi="Consolas" w:cs="Consolas"/>
-          <w:color w:val="202020"/>
-          <w:sz w:val="20"/>
-        </w:rPr>
-        <w:t xml:space="preserve">    &lt;form action="#" method="post"&gt;</w:t>
-        <w:br/>
-      </w:r>
-      <w:r>
-        <w:rPr>
-          <w:rFonts w:ascii="Consolas" w:hAnsi="Consolas" w:cs="Consolas"/>
-          <w:color w:val="202020"/>
-          <w:sz w:val="20"/>
-        </w:rPr>
-        <w:t xml:space="preserve"> </w:t>
-        <w:br/>
-      </w:r>
-      <w:r>
-        <w:rPr>
-          <w:rFonts w:ascii="Consolas" w:hAnsi="Consolas" w:cs="Consolas"/>
-          <w:color w:val="202020"/>
-          <w:sz w:val="20"/>
-        </w:rPr>
-        <w:t xml:space="preserve">      &lt;!-- basic account details: text, email, password --&gt;</w:t>
-        <w:br/>
-      </w:r>
-      <w:r>
-        <w:rPr>
-          <w:rFonts w:ascii="Consolas" w:hAnsi="Consolas" w:cs="Consolas"/>
-          <w:color w:val="202020"/>
-          <w:sz w:val="20"/>
-        </w:rPr>
-        <w:t xml:space="preserve">      &lt;fieldset&gt;</w:t>
-        <w:br/>
-      </w:r>
-      <w:r>
-        <w:rPr>
-          <w:rFonts w:ascii="Consolas" w:hAnsi="Consolas" w:cs="Consolas"/>
-          <w:color w:val="202020"/>
-          <w:sz w:val="20"/>
-        </w:rPr>
-        <w:t xml:space="preserve">        &lt;legend&gt;Account Details&lt;/legend&gt;</w:t>
-        <w:br/>
-      </w:r>
-      <w:r>
-        <w:rPr>
-          <w:rFonts w:ascii="Consolas" w:hAnsi="Consolas" w:cs="Consolas"/>
-          <w:color w:val="202020"/>
-          <w:sz w:val="20"/>
-        </w:rPr>
-        <w:t xml:space="preserve"> </w:t>
-        <w:br/>
-      </w:r>
-      <w:r>
-        <w:rPr>
-          <w:rFonts w:ascii="Consolas" w:hAnsi="Consolas" w:cs="Consolas"/>
-          <w:color w:val="202020"/>
-          <w:sz w:val="20"/>
-        </w:rPr>
-        <w:t xml:space="preserve">        &lt;label for="gamertag"&gt;Gamer Tag&lt;/label&gt;</w:t>
-        <w:br/>
-      </w:r>
-      <w:r>
-        <w:rPr>
-          <w:rFonts w:ascii="Consolas" w:hAnsi="Consolas" w:cs="Consolas"/>
-          <w:color w:val="202020"/>
-          <w:sz w:val="20"/>
-        </w:rPr>
-        <w:t xml:space="preserve">        &lt;input type="text" id="gamertag" name="gamertag" placeholder="how people will see you" required&gt;</w:t>
-        <w:br/>
-      </w:r>
-      <w:r>
-        <w:rPr>
-          <w:rFonts w:ascii="Consolas" w:hAnsi="Consolas" w:cs="Consolas"/>
-          <w:color w:val="202020"/>
-          <w:sz w:val="20"/>
-        </w:rPr>
-        <w:t xml:space="preserve"> </w:t>
-        <w:br/>
-      </w:r>
-      <w:r>
-        <w:rPr>
-          <w:rFonts w:ascii="Consolas" w:hAnsi="Consolas" w:cs="Consolas"/>
-          <w:color w:val="202020"/>
-          <w:sz w:val="20"/>
-        </w:rPr>
-        <w:t xml:space="preserve">        &lt;label for="email"&gt;Email&lt;/label&gt;</w:t>
-        <w:br/>
-      </w:r>
-      <w:r>
-        <w:rPr>
-          <w:rFonts w:ascii="Consolas" w:hAnsi="Consolas" w:cs="Consolas"/>
-          <w:color w:val="202020"/>
-          <w:sz w:val="20"/>
-        </w:rPr>
-        <w:t xml:space="preserve">        &lt;input type="email" id="email" name="email" placeholder="you@example.com" required&gt;</w:t>
-        <w:br/>
-      </w:r>
-      <w:r>
-        <w:rPr>
-          <w:rFonts w:ascii="Consolas" w:hAnsi="Consolas" w:cs="Consolas"/>
-          <w:color w:val="202020"/>
-          <w:sz w:val="20"/>
-        </w:rPr>
-        <w:t xml:space="preserve"> </w:t>
-        <w:br/>
-      </w:r>
-      <w:r>
-        <w:rPr>
-          <w:rFonts w:ascii="Consolas" w:hAnsi="Consolas" w:cs="Consolas"/>
-          <w:color w:val="202020"/>
-          <w:sz w:val="20"/>
-        </w:rPr>
-        <w:t xml:space="preserve">        &lt;label for="password"&gt;Password&lt;/label&gt;</w:t>
-        <w:br/>
-      </w:r>
-      <w:r>
-        <w:rPr>
-          <w:rFonts w:ascii="Consolas" w:hAnsi="Consolas" w:cs="Consolas"/>
-          <w:color w:val="202020"/>
-          <w:sz w:val="20"/>
-        </w:rPr>
-        <w:t xml:space="preserve">        &lt;input type="password" id="password" name="password" required&gt;</w:t>
-        <w:br/>
-      </w:r>
-      <w:r>
-        <w:rPr>
-          <w:rFonts w:ascii="Consolas" w:hAnsi="Consolas" w:cs="Consolas"/>
-          <w:color w:val="202020"/>
-          <w:sz w:val="20"/>
-        </w:rPr>
-        <w:t xml:space="preserve">      &lt;/fieldset&gt;</w:t>
-        <w:br/>
-      </w:r>
-      <w:r>
-        <w:rPr>
-          <w:rFonts w:ascii="Consolas" w:hAnsi="Consolas" w:cs="Consolas"/>
-          <w:color w:val="202020"/>
-          <w:sz w:val="20"/>
-        </w:rPr>
-        <w:t xml:space="preserve"> </w:t>
-        <w:br/>
-      </w:r>
-      <w:r>
-        <w:rPr>
-          <w:rFonts w:ascii="Consolas" w:hAnsi="Consolas" w:cs="Consolas"/>
-          <w:color w:val="202020"/>
-          <w:sz w:val="20"/>
-        </w:rPr>
-        <w:t xml:space="preserve">      &lt;!-- personal info: number, date --&gt;</w:t>
-        <w:br/>
-      </w:r>
-      <w:r>
-        <w:rPr>
-          <w:rFonts w:ascii="Consolas" w:hAnsi="Consolas" w:cs="Consolas"/>
-          <w:color w:val="202020"/>
-          <w:sz w:val="20"/>
-        </w:rPr>
-        <w:t xml:space="preserve">      &lt;fieldset&gt;</w:t>
-        <w:br/>
-      </w:r>
-      <w:r>
-        <w:rPr>
-          <w:rFonts w:ascii="Consolas" w:hAnsi="Consolas" w:cs="Consolas"/>
-          <w:color w:val="202020"/>
-          <w:sz w:val="20"/>
-        </w:rPr>
-        <w:t xml:space="preserve">        &lt;legend&gt;About You&lt;/legend&gt;</w:t>
-        <w:br/>
-      </w:r>
-      <w:r>
-        <w:rPr>
-          <w:rFonts w:ascii="Consolas" w:hAnsi="Consolas" w:cs="Consolas"/>
-          <w:color w:val="202020"/>
-          <w:sz w:val="20"/>
-        </w:rPr>
-        <w:t xml:space="preserve"> </w:t>
-        <w:br/>
-      </w:r>
-      <w:r>
-        <w:rPr>
-          <w:rFonts w:ascii="Consolas" w:hAnsi="Consolas" w:cs="Consolas"/>
-          <w:color w:val="202020"/>
-          <w:sz w:val="20"/>
-        </w:rPr>
-        <w:t xml:space="preserve">        &lt;label for="age"&gt;Age&lt;/label&gt;</w:t>
-        <w:br/>
-      </w:r>
-      <w:r>
-        <w:rPr>
-          <w:rFonts w:ascii="Consolas" w:hAnsi="Consolas" w:cs="Consolas"/>
-          <w:color w:val="202020"/>
-          <w:sz w:val="20"/>
-        </w:rPr>
-        <w:t xml:space="preserve">        &lt;input type="number" id="age" name="age" min="13" max="99"&gt;</w:t>
-        <w:br/>
-      </w:r>
-      <w:r>
-        <w:rPr>
-          <w:rFonts w:ascii="Consolas" w:hAnsi="Consolas" w:cs="Consolas"/>
-          <w:color w:val="202020"/>
-          <w:sz w:val="20"/>
-        </w:rPr>
-        <w:t xml:space="preserve"> </w:t>
-        <w:br/>
-      </w:r>
-      <w:r>
-        <w:rPr>
-          <w:rFonts w:ascii="Consolas" w:hAnsi="Consolas" w:cs="Consolas"/>
-          <w:color w:val="202020"/>
-          <w:sz w:val="20"/>
-        </w:rPr>
-        <w:t xml:space="preserve">        &lt;label for="dob"&gt;Date of Birth&lt;/label&gt;</w:t>
-        <w:br/>
-      </w:r>
-      <w:r>
-        <w:rPr>
-          <w:rFonts w:ascii="Consolas" w:hAnsi="Consolas" w:cs="Consolas"/>
-          <w:color w:val="202020"/>
-          <w:sz w:val="20"/>
-        </w:rPr>
-        <w:t xml:space="preserve">        &lt;input type="date" id="dob" name="dob"&gt;</w:t>
-        <w:br/>
-      </w:r>
-      <w:r>
-        <w:rPr>
-          <w:rFonts w:ascii="Consolas" w:hAnsi="Consolas" w:cs="Consolas"/>
-          <w:color w:val="202020"/>
-          <w:sz w:val="20"/>
-        </w:rPr>
-        <w:t xml:space="preserve"> </w:t>
-        <w:br/>
-      </w:r>
-      <w:r>
-        <w:rPr>
-          <w:rFonts w:ascii="Consolas" w:hAnsi="Consolas" w:cs="Consolas"/>
-          <w:color w:val="202020"/>
-          <w:sz w:val="20"/>
-        </w:rPr>
-        <w:t xml:space="preserve">        &lt;!-- radio buttons --&gt;</w:t>
-        <w:br/>
-      </w:r>
-      <w:r>
-        <w:rPr>
-          <w:rFonts w:ascii="Consolas" w:hAnsi="Consolas" w:cs="Consolas"/>
-          <w:color w:val="202020"/>
-          <w:sz w:val="20"/>
-        </w:rPr>
-        <w:t xml:space="preserve">        &lt;label&gt;Main Platform&lt;/label&gt;</w:t>
-        <w:br/>
-      </w:r>
-      <w:r>
-        <w:rPr>
-          <w:rFonts w:ascii="Consolas" w:hAnsi="Consolas" w:cs="Consolas"/>
-          <w:color w:val="202020"/>
-          <w:sz w:val="20"/>
-        </w:rPr>
-        <w:t xml:space="preserve">        &lt;div class="inline-group"&gt;</w:t>
-        <w:br/>
-      </w:r>
-      <w:r>
-        <w:rPr>
-          <w:rFonts w:ascii="Consolas" w:hAnsi="Consolas" w:cs="Consolas"/>
-          <w:color w:val="202020"/>
-          <w:sz w:val="20"/>
-        </w:rPr>
-        <w:t xml:space="preserve">          &lt;label&gt;&lt;input type="radio" name="platform" value="pc"&gt; PC&lt;/label&gt;</w:t>
-        <w:br/>
-      </w:r>
-      <w:r>
-        <w:rPr>
-          <w:rFonts w:ascii="Consolas" w:hAnsi="Consolas" w:cs="Consolas"/>
-          <w:color w:val="202020"/>
-          <w:sz w:val="20"/>
-        </w:rPr>
-        <w:t xml:space="preserve">          &lt;label&gt;&lt;input type="radio" name="platform" value="console"&gt; Console&lt;/label&gt;</w:t>
-        <w:br/>
-      </w:r>
-      <w:r>
-        <w:rPr>
-          <w:rFonts w:ascii="Consolas" w:hAnsi="Consolas" w:cs="Consolas"/>
-          <w:color w:val="202020"/>
-          <w:sz w:val="20"/>
-        </w:rPr>
-        <w:t xml:space="preserve">          &lt;label&gt;&lt;input type="radio" name="platform" value="mobile"&gt; Mobile&lt;/label&gt;</w:t>
-        <w:br/>
-      </w:r>
-      <w:r>
-        <w:rPr>
-          <w:rFonts w:ascii="Consolas" w:hAnsi="Consolas" w:cs="Consolas"/>
-          <w:color w:val="202020"/>
-          <w:sz w:val="20"/>
-        </w:rPr>
-        <w:t xml:space="preserve">        &lt;/div&gt;</w:t>
-        <w:br/>
-      </w:r>
-      <w:r>
-        <w:rPr>
-          <w:rFonts w:ascii="Consolas" w:hAnsi="Consolas" w:cs="Consolas"/>
-          <w:color w:val="202020"/>
-          <w:sz w:val="20"/>
-        </w:rPr>
-        <w:t xml:space="preserve">      &lt;/fieldset&gt;</w:t>
-        <w:br/>
-      </w:r>
-      <w:r>
-        <w:rPr>
-          <w:rFonts w:ascii="Consolas" w:hAnsi="Consolas" w:cs="Consolas"/>
-          <w:color w:val="202020"/>
-          <w:sz w:val="20"/>
-        </w:rPr>
-        <w:t xml:space="preserve"> </w:t>
-        <w:br/>
-      </w:r>
-      <w:r>
-        <w:rPr>
-          <w:rFonts w:ascii="Consolas" w:hAnsi="Consolas" w:cs="Consolas"/>
-          <w:color w:val="202020"/>
-          <w:sz w:val="20"/>
-        </w:rPr>
-        <w:t xml:space="preserve">      &lt;!-- game preferences: checkboxes, select, datalist, range, color --&gt;</w:t>
-        <w:br/>
-      </w:r>
-      <w:r>
-        <w:rPr>
-          <w:rFonts w:ascii="Consolas" w:hAnsi="Consolas" w:cs="Consolas"/>
-          <w:color w:val="202020"/>
-          <w:sz w:val="20"/>
-        </w:rPr>
-        <w:t xml:space="preserve">      &lt;fieldset&gt;</w:t>
-        <w:br/>
-      </w:r>
-      <w:r>
-        <w:rPr>
-          <w:rFonts w:ascii="Consolas" w:hAnsi="Consolas" w:cs="Consolas"/>
-          <w:color w:val="202020"/>
-          <w:sz w:val="20"/>
-        </w:rPr>
-        <w:t xml:space="preserve">        &lt;legend&gt;Gaming Preferences&lt;/legend&gt;</w:t>
-        <w:br/>
-      </w:r>
-      <w:r>
-        <w:rPr>
-          <w:rFonts w:ascii="Consolas" w:hAnsi="Consolas" w:cs="Consolas"/>
-          <w:color w:val="202020"/>
-          <w:sz w:val="20"/>
-        </w:rPr>
-        <w:t xml:space="preserve"> </w:t>
-        <w:br/>
-      </w:r>
-      <w:r>
-        <w:rPr>
-          <w:rFonts w:ascii="Consolas" w:hAnsi="Consolas" w:cs="Consolas"/>
-          <w:color w:val="202020"/>
-          <w:sz w:val="20"/>
-        </w:rPr>
-        <w:t xml:space="preserve">        &lt;!-- checkboxes --&gt;</w:t>
-        <w:br/>
-      </w:r>
-      <w:r>
-        <w:rPr>
-          <w:rFonts w:ascii="Consolas" w:hAnsi="Consolas" w:cs="Consolas"/>
-          <w:color w:val="202020"/>
-          <w:sz w:val="20"/>
-        </w:rPr>
-        <w:t xml:space="preserve">        &lt;label&gt;Games You're Into&lt;/label&gt;</w:t>
-        <w:br/>
-      </w:r>
-      <w:r>
-        <w:rPr>
-          <w:rFonts w:ascii="Consolas" w:hAnsi="Consolas" w:cs="Consolas"/>
-          <w:color w:val="202020"/>
-          <w:sz w:val="20"/>
-        </w:rPr>
-        <w:t xml:space="preserve">        &lt;div class="inline-group"&gt;</w:t>
-        <w:br/>
-      </w:r>
-      <w:r>
-        <w:rPr>
-          <w:rFonts w:ascii="Consolas" w:hAnsi="Consolas" w:cs="Consolas"/>
-          <w:color w:val="202020"/>
-          <w:sz w:val="20"/>
-        </w:rPr>
-        <w:t xml:space="preserve">          &lt;label&gt;&lt;input type="checkbox" name="games" value="battle-royale"&gt; Battle Royale&lt;/label&gt;</w:t>
-        <w:br/>
-      </w:r>
-      <w:r>
-        <w:rPr>
-          <w:rFonts w:ascii="Consolas" w:hAnsi="Consolas" w:cs="Consolas"/>
-          <w:color w:val="202020"/>
-          <w:sz w:val="20"/>
-        </w:rPr>
-        <w:t xml:space="preserve">          &lt;label&gt;&lt;input type="checkbox" name="games" value="racing"&gt; Racing&lt;/label&gt;</w:t>
-        <w:br/>
-      </w:r>
-      <w:r>
-        <w:rPr>
-          <w:rFonts w:ascii="Consolas" w:hAnsi="Consolas" w:cs="Consolas"/>
-          <w:color w:val="202020"/>
-          <w:sz w:val="20"/>
-        </w:rPr>
-        <w:t xml:space="preserve">          &lt;label&gt;&lt;input type="checkbox" name="games" value="mmorpg"&gt; MMORPG&lt;/label&gt;</w:t>
-        <w:br/>
-      </w:r>
-      <w:r>
-        <w:rPr>
-          <w:rFonts w:ascii="Consolas" w:hAnsi="Consolas" w:cs="Consolas"/>
-          <w:color w:val="202020"/>
-          <w:sz w:val="20"/>
-        </w:rPr>
-        <w:t xml:space="preserve">          &lt;label&gt;&lt;input type="checkbox" name="games" value="fps"&gt; FPS&lt;/label&gt;</w:t>
-        <w:br/>
-      </w:r>
-      <w:r>
-        <w:rPr>
-          <w:rFonts w:ascii="Consolas" w:hAnsi="Consolas" w:cs="Consolas"/>
-          <w:color w:val="202020"/>
-          <w:sz w:val="20"/>
-        </w:rPr>
-        <w:t xml:space="preserve">        &lt;/div&gt;</w:t>
-        <w:br/>
-      </w:r>
-      <w:r>
-        <w:rPr>
-          <w:rFonts w:ascii="Consolas" w:hAnsi="Consolas" w:cs="Consolas"/>
-          <w:color w:val="202020"/>
-          <w:sz w:val="20"/>
-        </w:rPr>
-        <w:t xml:space="preserve"> </w:t>
-        <w:br/>
-      </w:r>
-      <w:r>
-        <w:rPr>
-          <w:rFonts w:ascii="Consolas" w:hAnsi="Consolas" w:cs="Consolas"/>
-          <w:color w:val="202020"/>
-          <w:sz w:val="20"/>
-        </w:rPr>
-        <w:t xml:space="preserve">        &lt;!-- dropdown --&gt;</w:t>
-        <w:br/>
-      </w:r>
-      <w:r>
-        <w:rPr>
-          <w:rFonts w:ascii="Consolas" w:hAnsi="Consolas" w:cs="Consolas"/>
-          <w:color w:val="202020"/>
-          <w:sz w:val="20"/>
-        </w:rPr>
-        <w:t xml:space="preserve">        &lt;label for="heard"&gt;How Did You Hear About Us?&lt;/label&gt;</w:t>
-        <w:br/>
-      </w:r>
-      <w:r>
-        <w:rPr>
-          <w:rFonts w:ascii="Consolas" w:hAnsi="Consolas" w:cs="Consolas"/>
-          <w:color w:val="202020"/>
-          <w:sz w:val="20"/>
-        </w:rPr>
-        <w:t xml:space="preserve">        &lt;select id="heard" name="heard"&gt;</w:t>
-        <w:br/>
-      </w:r>
-      <w:r>
-        <w:rPr>
-          <w:rFonts w:ascii="Consolas" w:hAnsi="Consolas" w:cs="Consolas"/>
-          <w:color w:val="202020"/>
-          <w:sz w:val="20"/>
-        </w:rPr>
-        <w:t xml:space="preserve">          &lt;option value="friend"&gt;A friend told me&lt;/option&gt;</w:t>
-        <w:br/>
-      </w:r>
-      <w:r>
-        <w:rPr>
-          <w:rFonts w:ascii="Consolas" w:hAnsi="Consolas" w:cs="Consolas"/>
-          <w:color w:val="202020"/>
-          <w:sz w:val="20"/>
-        </w:rPr>
-        <w:t xml:space="preserve">          &lt;option value="youtube"&gt;YouTube&lt;/option&gt;</w:t>
-        <w:br/>
-      </w:r>
-      <w:r>
-        <w:rPr>
-          <w:rFonts w:ascii="Consolas" w:hAnsi="Consolas" w:cs="Consolas"/>
-          <w:color w:val="202020"/>
-          <w:sz w:val="20"/>
-        </w:rPr>
-        <w:t xml:space="preserve">          &lt;option value="reddit"&gt;Reddit&lt;/option&gt;</w:t>
-        <w:br/>
-      </w:r>
-      <w:r>
-        <w:rPr>
-          <w:rFonts w:ascii="Consolas" w:hAnsi="Consolas" w:cs="Consolas"/>
-          <w:color w:val="202020"/>
-          <w:sz w:val="20"/>
-        </w:rPr>
-        <w:t xml:space="preserve">          &lt;option value="discord"&gt;Another Discord server&lt;/option&gt;</w:t>
-        <w:br/>
-      </w:r>
-      <w:r>
-        <w:rPr>
-          <w:rFonts w:ascii="Consolas" w:hAnsi="Consolas" w:cs="Consolas"/>
-          <w:color w:val="202020"/>
-          <w:sz w:val="20"/>
-        </w:rPr>
-        <w:t xml:space="preserve">          &lt;option value="other"&gt;Other&lt;/option&gt;</w:t>
-        <w:br/>
-      </w:r>
-      <w:r>
-        <w:rPr>
-          <w:rFonts w:ascii="Consolas" w:hAnsi="Consolas" w:cs="Consolas"/>
-          <w:color w:val="202020"/>
-          <w:sz w:val="20"/>
-        </w:rPr>
-        <w:t xml:space="preserve">        &lt;/select&gt;</w:t>
-        <w:br/>
-      </w:r>
-      <w:r>
-        <w:rPr>
-          <w:rFonts w:ascii="Consolas" w:hAnsi="Consolas" w:cs="Consolas"/>
-          <w:color w:val="202020"/>
-          <w:sz w:val="20"/>
-        </w:rPr>
-        <w:t xml:space="preserve"> </w:t>
-        <w:br/>
-      </w:r>
-      <w:r>
-        <w:rPr>
-          <w:rFonts w:ascii="Consolas" w:hAnsi="Consolas" w:cs="Consolas"/>
-          <w:color w:val="202020"/>
-          <w:sz w:val="20"/>
-        </w:rPr>
-        <w:t xml:space="preserve">        &lt;!-- datalist --&gt;</w:t>
-        <w:br/>
-      </w:r>
-      <w:r>
-        <w:rPr>
-          <w:rFonts w:ascii="Consolas" w:hAnsi="Consolas" w:cs="Consolas"/>
-          <w:color w:val="202020"/>
-          <w:sz w:val="20"/>
-        </w:rPr>
-        <w:t xml:space="preserve">        &lt;label for="region"&gt;Closest Server Region&lt;/label&gt;</w:t>
-        <w:br/>
-      </w:r>
-      <w:r>
-        <w:rPr>
-          <w:rFonts w:ascii="Consolas" w:hAnsi="Consolas" w:cs="Consolas"/>
-          <w:color w:val="202020"/>
-          <w:sz w:val="20"/>
-        </w:rPr>
-        <w:t xml:space="preserve">        &lt;input list="regions" name="region" id="region" placeholder="start typing a city"&gt;</w:t>
-        <w:br/>
-      </w:r>
-      <w:r>
-        <w:rPr>
-          <w:rFonts w:ascii="Consolas" w:hAnsi="Consolas" w:cs="Consolas"/>
-          <w:color w:val="202020"/>
-          <w:sz w:val="20"/>
-        </w:rPr>
-        <w:t xml:space="preserve">        &lt;datalist id="regions"&gt;</w:t>
-        <w:br/>
-      </w:r>
-      <w:r>
-        <w:rPr>
-          <w:rFonts w:ascii="Consolas" w:hAnsi="Consolas" w:cs="Consolas"/>
-          <w:color w:val="202020"/>
-          <w:sz w:val="20"/>
-        </w:rPr>
-        <w:t xml:space="preserve">          &lt;option value="Mumbai"&gt;</w:t>
-        <w:br/>
-      </w:r>
-      <w:r>
-        <w:rPr>
-          <w:rFonts w:ascii="Consolas" w:hAnsi="Consolas" w:cs="Consolas"/>
-          <w:color w:val="202020"/>
-          <w:sz w:val="20"/>
-        </w:rPr>
-        <w:t xml:space="preserve">          &lt;option value="Chennai"&gt;</w:t>
-        <w:br/>
-      </w:r>
-      <w:r>
-        <w:rPr>
-          <w:rFonts w:ascii="Consolas" w:hAnsi="Consolas" w:cs="Consolas"/>
-          <w:color w:val="202020"/>
-          <w:sz w:val="20"/>
-        </w:rPr>
-        <w:t xml:space="preserve">          &lt;option value="Bangalore"&gt;</w:t>
-        <w:br/>
-      </w:r>
-      <w:r>
-        <w:rPr>
-          <w:rFonts w:ascii="Consolas" w:hAnsi="Consolas" w:cs="Consolas"/>
-          <w:color w:val="202020"/>
-          <w:sz w:val="20"/>
-        </w:rPr>
-        <w:t xml:space="preserve">          &lt;option value="Singapore"&gt;</w:t>
-        <w:br/>
-      </w:r>
-      <w:r>
-        <w:rPr>
-          <w:rFonts w:ascii="Consolas" w:hAnsi="Consolas" w:cs="Consolas"/>
-          <w:color w:val="202020"/>
-          <w:sz w:val="20"/>
-        </w:rPr>
-        <w:t xml:space="preserve">          &lt;option value="London"&gt;</w:t>
-        <w:br/>
-      </w:r>
-      <w:r>
-        <w:rPr>
-          <w:rFonts w:ascii="Consolas" w:hAnsi="Consolas" w:cs="Consolas"/>
-          <w:color w:val="202020"/>
-          <w:sz w:val="20"/>
-        </w:rPr>
-        <w:t xml:space="preserve">        &lt;/datalist&gt;</w:t>
-        <w:br/>
-      </w:r>
-      <w:r>
-        <w:rPr>
-          <w:rFonts w:ascii="Consolas" w:hAnsi="Consolas" w:cs="Consolas"/>
-          <w:color w:val="202020"/>
-          <w:sz w:val="20"/>
-        </w:rPr>
-        <w:t xml:space="preserve"> </w:t>
-        <w:br/>
-      </w:r>
-      <w:r>
-        <w:rPr>
-          <w:rFonts w:ascii="Consolas" w:hAnsi="Consolas" w:cs="Consolas"/>
-          <w:color w:val="202020"/>
-          <w:sz w:val="20"/>
-        </w:rPr>
-        <w:t xml:space="preserve">        &lt;!-- range --&gt;</w:t>
-        <w:br/>
-      </w:r>
-      <w:r>
-        <w:rPr>
-          <w:rFonts w:ascii="Consolas" w:hAnsi="Consolas" w:cs="Consolas"/>
-          <w:color w:val="202020"/>
-          <w:sz w:val="20"/>
-        </w:rPr>
-        <w:t xml:space="preserve">        &lt;label for="rating"&gt;Rate Your Skill Level (1-10)&lt;/label&gt;</w:t>
-        <w:br/>
-      </w:r>
-      <w:r>
-        <w:rPr>
-          <w:rFonts w:ascii="Consolas" w:hAnsi="Consolas" w:cs="Consolas"/>
-          <w:color w:val="202020"/>
-          <w:sz w:val="20"/>
-        </w:rPr>
-        <w:t xml:space="preserve">        &lt;input type="range" id="rating" name="rating" min="1" max="10" value="5"&gt;</w:t>
-        <w:br/>
-      </w:r>
-      <w:r>
-        <w:rPr>
-          <w:rFonts w:ascii="Consolas" w:hAnsi="Consolas" w:cs="Consolas"/>
-          <w:color w:val="202020"/>
-          <w:sz w:val="20"/>
-        </w:rPr>
-        <w:t xml:space="preserve"> </w:t>
-        <w:br/>
-      </w:r>
-      <w:r>
-        <w:rPr>
-          <w:rFonts w:ascii="Consolas" w:hAnsi="Consolas" w:cs="Consolas"/>
-          <w:color w:val="202020"/>
-          <w:sz w:val="20"/>
-        </w:rPr>
-        <w:t xml:space="preserve">        &lt;!-- color --&gt;</w:t>
-        <w:br/>
-      </w:r>
-      <w:r>
-        <w:rPr>
-          <w:rFonts w:ascii="Consolas" w:hAnsi="Consolas" w:cs="Consolas"/>
-          <w:color w:val="202020"/>
-          <w:sz w:val="20"/>
-        </w:rPr>
-        <w:t xml:space="preserve">        &lt;label for="accent"&gt;Pick a Profile Accent Color&lt;/label&gt;</w:t>
-        <w:br/>
-      </w:r>
-      <w:r>
-        <w:rPr>
-          <w:rFonts w:ascii="Consolas" w:hAnsi="Consolas" w:cs="Consolas"/>
-          <w:color w:val="202020"/>
-          <w:sz w:val="20"/>
-        </w:rPr>
-        <w:t xml:space="preserve">        &lt;input type="color" id="accent" name="accent" value="#e8792c"&gt;</w:t>
-        <w:br/>
-      </w:r>
-      <w:r>
-        <w:rPr>
-          <w:rFonts w:ascii="Consolas" w:hAnsi="Consolas" w:cs="Consolas"/>
-          <w:color w:val="202020"/>
-          <w:sz w:val="20"/>
-        </w:rPr>
-        <w:t xml:space="preserve">      &lt;/fieldset&gt;</w:t>
-        <w:br/>
-      </w:r>
-      <w:r>
-        <w:rPr>
-          <w:rFonts w:ascii="Consolas" w:hAnsi="Consolas" w:cs="Consolas"/>
-          <w:color w:val="202020"/>
-          <w:sz w:val="20"/>
-        </w:rPr>
-        <w:t xml:space="preserve"> </w:t>
-        <w:br/>
-      </w:r>
-      <w:r>
-        <w:rPr>
-          <w:rFonts w:ascii="Consolas" w:hAnsi="Consolas" w:cs="Consolas"/>
-          <w:color w:val="202020"/>
-          <w:sz w:val="20"/>
-        </w:rPr>
-        <w:t xml:space="preserve">      &lt;button type="submit"&gt;Create Account&lt;/button&gt;</w:t>
-        <w:br/>
-      </w:r>
-      <w:r>
-        <w:rPr>
-          <w:rFonts w:ascii="Consolas" w:hAnsi="Consolas" w:cs="Consolas"/>
-          <w:color w:val="202020"/>
-          <w:sz w:val="20"/>
-        </w:rPr>
-        <w:t xml:space="preserve">    &lt;/form&gt;</w:t>
+        <w:t xml:space="preserve">  &lt;!-- footer --&gt;</w:t>
+        <w:br/>
+      </w:r>
+      <w:r>
+        <w:rPr>
+          <w:rFonts w:ascii="Consolas" w:hAnsi="Consolas" w:cs="Consolas"/>
+          <w:color w:val="202020"/>
+          <w:sz w:val="20"/>
+        </w:rPr>
+        <w:t xml:space="preserve">  &lt;div style="color: #b7b1a4"&gt;</w:t>
+        <w:br/>
+      </w:r>
+      <w:r>
+        <w:rPr>
+          <w:rFonts w:ascii="Consolas" w:hAnsi="Consolas" w:cs="Consolas"/>
+          <w:color w:val="202020"/>
+          <w:sz w:val="20"/>
+        </w:rPr>
+        <w:t xml:space="preserve">    &lt;p&gt;&lt;small&gt;&amp;copy; 2026 Respawn Point. Made for URK24CS1021's Web Tech lab, not an actual gaming company.&lt;/small&gt;&lt;/p&gt;</w:t>
         <w:br/>
       </w:r>
       <w:r>
@@ -2642,42 +1319,6 @@
           <w:sz w:val="20"/>
         </w:rPr>
         <w:t xml:space="preserve">  &lt;/div&gt;</w:t>
-        <w:br/>
-      </w:r>
-      <w:r>
-        <w:rPr>
-          <w:rFonts w:ascii="Consolas" w:hAnsi="Consolas" w:cs="Consolas"/>
-          <w:color w:val="202020"/>
-          <w:sz w:val="20"/>
-        </w:rPr>
-        <w:t xml:space="preserve"> </w:t>
-        <w:br/>
-      </w:r>
-      <w:r>
-        <w:rPr>
-          <w:rFonts w:ascii="Consolas" w:hAnsi="Consolas" w:cs="Consolas"/>
-          <w:color w:val="202020"/>
-          <w:sz w:val="20"/>
-        </w:rPr>
-        <w:t xml:space="preserve">  &lt;footer&gt;</w:t>
-        <w:br/>
-      </w:r>
-      <w:r>
-        <w:rPr>
-          <w:rFonts w:ascii="Consolas" w:hAnsi="Consolas" w:cs="Consolas"/>
-          <w:color w:val="202020"/>
-          <w:sz w:val="20"/>
-        </w:rPr>
-        <w:t xml:space="preserve">    &lt;p&gt;&amp;copy; 2026 Respawn Point. Made for URK24CS1021's Web Tech lab, not an actual gaming company.&lt;/p&gt;</w:t>
-        <w:br/>
-      </w:r>
-      <w:r>
-        <w:rPr>
-          <w:rFonts w:ascii="Consolas" w:hAnsi="Consolas" w:cs="Consolas"/>
-          <w:color w:val="202020"/>
-          <w:sz w:val="20"/>
-        </w:rPr>
-        <w:t xml:space="preserve">  &lt;/footer&gt;</w:t>
         <w:br/>
       </w:r>
       <w:r>
@@ -2779,7 +1420,7 @@
           <w:i/>
           <w:sz w:val="20"/>
         </w:rPr>
-        <w:t>Account Details and About You</w:t>
+        <w:t>The empty form, showing every input type</w:t>
       </w:r>
     </w:p>
     <w:p>
@@ -2790,7 +1431,7 @@
       <w:r>
         <w:drawing>
           <wp:inline xmlns:a="http://schemas.openxmlformats.org/drawingml/2006/main" xmlns:pic="http://schemas.openxmlformats.org/drawingml/2006/picture">
-            <wp:extent cx="5669280" cy="3903015"/>
+            <wp:extent cx="5669280" cy="3058774"/>
             <wp:docPr id="1" name="Picture 1"/>
             <wp:cNvGraphicFramePr>
               <a:graphicFrameLocks noChangeAspect="1"/>
@@ -2811,7 +1452,7 @@
                   <pic:spPr>
                     <a:xfrm>
                       <a:off x="0" y="0"/>
-                      <a:ext cx="5669280" cy="3903015"/>
+                      <a:ext cx="5669280" cy="3058774"/>
                     </a:xfrm>
                     <a:prstGeom prst="rect"/>
                   </pic:spPr>
@@ -2831,7 +1472,7 @@
           <w:i/>
           <w:sz w:val="20"/>
         </w:rPr>
-        <w:t>Gaming Preferences and the submit button</w:t>
+        <w:t>The same form after filling it in and using each control</w:t>
       </w:r>
     </w:p>
     <w:p>
@@ -2842,7 +1483,7 @@
       <w:r>
         <w:drawing>
           <wp:inline xmlns:a="http://schemas.openxmlformats.org/drawingml/2006/main" xmlns:pic="http://schemas.openxmlformats.org/drawingml/2006/picture">
-            <wp:extent cx="5669280" cy="3903015"/>
+            <wp:extent cx="5669280" cy="3058774"/>
             <wp:docPr id="2" name="Picture 2"/>
             <wp:cNvGraphicFramePr>
               <a:graphicFrameLocks noChangeAspect="1"/>
@@ -2863,7 +1504,7 @@
                   <pic:spPr>
                     <a:xfrm>
                       <a:off x="0" y="0"/>
-                      <a:ext cx="5669280" cy="3903015"/>
+                      <a:ext cx="5669280" cy="3058774"/>
                     </a:xfrm>
                     <a:prstGeom prst="rect"/>
                   </pic:spPr>

</xml_diff>